<commit_message>
Fix ECMA-376 schema ordering in Word docx for 100% Microsoft Word compatibility
</commit_message>
<xml_diff>
--- a/Fenix_IT_Mall_Project_Report.docx
+++ b/Fenix_IT_Mall_Project_Report.docx
@@ -216,7 +216,7 @@
     </w:p>
     <w:p>
       <w:pPr>
-        <w:spacing w:before="120" w:after="360"/>
+        <w:spacing w:before="80" w:after="360"/>
         <w:jc w:val="center"/>
       </w:pPr>
       <w:r>
@@ -311,7 +311,7 @@
     </w:p>
     <w:p>
       <w:pPr>
-        <w:spacing w:before="120" w:after="360"/>
+        <w:spacing w:before="80" w:after="360"/>
         <w:jc w:val="center"/>
       </w:pPr>
       <w:r>
@@ -981,7 +981,7 @@
     </w:p>
     <w:p>
       <w:pPr>
-        <w:spacing w:before="120" w:after="440"/>
+        <w:spacing w:before="80" w:after="440"/>
         <w:jc w:val="center"/>
       </w:pPr>
       <w:r>
@@ -1225,7 +1225,7 @@
     </w:p>
     <w:p>
       <w:pPr>
-        <w:spacing w:before="120" w:after="560"/>
+        <w:spacing w:before="80" w:after="560"/>
         <w:jc w:val="center"/>
       </w:pPr>
       <w:r>
@@ -1319,7 +1319,7 @@
     </w:p>
     <w:p>
       <w:pPr>
-        <w:spacing w:before="120" w:after="440"/>
+        <w:spacing w:before="80" w:after="440"/>
         <w:jc w:val="center"/>
       </w:pPr>
       <w:r>
@@ -1513,7 +1513,7 @@
     </w:p>
     <w:p>
       <w:pPr>
-        <w:spacing w:before="120" w:after="200"/>
+        <w:spacing w:before="80" w:after="200"/>
         <w:jc w:val="center"/>
       </w:pPr>
       <w:r>
@@ -1527,7 +1527,7 @@
     </w:p>
     <w:p>
       <w:pPr>
-        <w:spacing w:after="280"/>
+        <w:spacing w:after="240"/>
         <w:jc w:val="center"/>
       </w:pPr>
       <w:r>
@@ -1545,7 +1545,7 @@
       <w:r>
         <w:drawing>
           <wp:inline xmlns:a="http://schemas.openxmlformats.org/drawingml/2006/main" xmlns:pic="http://schemas.openxmlformats.org/drawingml/2006/picture">
-            <wp:extent cx="5852160" cy="3576320"/>
+            <wp:extent cx="5486400" cy="3352800"/>
             <wp:docPr id="1" name="Picture 1"/>
             <wp:cNvGraphicFramePr>
               <a:graphicFrameLocks noChangeAspect="1"/>
@@ -1566,7 +1566,7 @@
                   <pic:spPr>
                     <a:xfrm>
                       <a:off x="0" y="0"/>
-                      <a:ext cx="5852160" cy="3576320"/>
+                      <a:ext cx="5486400" cy="3352800"/>
                     </a:xfrm>
                     <a:prstGeom prst="rect"/>
                   </pic:spPr>
@@ -1584,7 +1584,7 @@
     </w:p>
     <w:p>
       <w:pPr>
-        <w:spacing w:before="120" w:after="200"/>
+        <w:spacing w:before="80" w:after="200"/>
         <w:jc w:val="center"/>
       </w:pPr>
       <w:r>
@@ -1598,7 +1598,7 @@
     </w:p>
     <w:p>
       <w:pPr>
-        <w:spacing w:after="280"/>
+        <w:spacing w:after="240"/>
         <w:jc w:val="center"/>
       </w:pPr>
       <w:r>
@@ -1616,7 +1616,7 @@
       <w:r>
         <w:drawing>
           <wp:inline xmlns:a="http://schemas.openxmlformats.org/drawingml/2006/main" xmlns:pic="http://schemas.openxmlformats.org/drawingml/2006/picture">
-            <wp:extent cx="5852160" cy="3511296"/>
+            <wp:extent cx="5486400" cy="3291840"/>
             <wp:docPr id="2" name="Picture 2"/>
             <wp:cNvGraphicFramePr>
               <a:graphicFrameLocks noChangeAspect="1"/>
@@ -1637,7 +1637,7 @@
                   <pic:spPr>
                     <a:xfrm>
                       <a:off x="0" y="0"/>
-                      <a:ext cx="5852160" cy="3511296"/>
+                      <a:ext cx="5486400" cy="3291840"/>
                     </a:xfrm>
                     <a:prstGeom prst="rect"/>
                   </pic:spPr>
@@ -1655,7 +1655,7 @@
     </w:p>
     <w:p>
       <w:pPr>
-        <w:spacing w:before="120" w:after="200"/>
+        <w:spacing w:before="80" w:after="200"/>
         <w:jc w:val="center"/>
       </w:pPr>
       <w:r>
@@ -1669,7 +1669,7 @@
     </w:p>
     <w:p>
       <w:pPr>
-        <w:spacing w:after="280" w:line="320" w:lineRule="exact"/>
+        <w:spacing w:after="240" w:line="320" w:lineRule="exact"/>
         <w:jc w:val="both"/>
       </w:pPr>
       <w:r>
@@ -1686,7 +1686,7 @@
       <w:r>
         <w:drawing>
           <wp:inline xmlns:a="http://schemas.openxmlformats.org/drawingml/2006/main" xmlns:pic="http://schemas.openxmlformats.org/drawingml/2006/picture">
-            <wp:extent cx="5852160" cy="3724102"/>
+            <wp:extent cx="5486400" cy="3491345"/>
             <wp:docPr id="3" name="Picture 3"/>
             <wp:cNvGraphicFramePr>
               <a:graphicFrameLocks noChangeAspect="1"/>
@@ -1707,7 +1707,7 @@
                   <pic:spPr>
                     <a:xfrm>
                       <a:off x="0" y="0"/>
-                      <a:ext cx="5852160" cy="3724102"/>
+                      <a:ext cx="5486400" cy="3491345"/>
                     </a:xfrm>
                     <a:prstGeom prst="rect"/>
                   </pic:spPr>
@@ -1725,7 +1725,7 @@
     </w:p>
     <w:p>
       <w:pPr>
-        <w:spacing w:before="120" w:after="280"/>
+        <w:spacing w:before="80" w:after="280"/>
         <w:jc w:val="center"/>
       </w:pPr>
       <w:r>
@@ -1888,7 +1888,7 @@
     </w:p>
     <w:p>
       <w:pPr>
-        <w:spacing w:before="120" w:after="480"/>
+        <w:spacing w:before="80" w:after="480"/>
         <w:jc w:val="center"/>
       </w:pPr>
       <w:r>
@@ -2066,7 +2066,6 @@
       <w:tblPr>
         <w:tblW w:type="auto" w:w="0"/>
         <w:jc w:val="center"/>
-        <w:tblLook w:firstColumn="1" w:firstRow="1" w:lastColumn="0" w:lastRow="0" w:noHBand="0" w:noVBand="1" w:val="04A0"/>
         <w:tblBorders>
           <w:top w:val="single" w:sz="4" w:space="0" w:color="000000"/>
           <w:left w:val="single" w:sz="4" w:space="0" w:color="000000"/>
@@ -2075,6 +2074,7 @@
           <w:insideH w:val="single" w:sz="4" w:space="0" w:color="000000"/>
           <w:insideV w:val="single" w:sz="4" w:space="0" w:color="000000"/>
         </w:tblBorders>
+        <w:tblLook w:firstColumn="1" w:firstRow="1" w:lastColumn="0" w:lastRow="0" w:noHBand="0" w:noVBand="1" w:val="04A0"/>
       </w:tblPr>
       <w:tblGrid>
         <w:gridCol w:w="3202"/>
@@ -2085,13 +2085,13 @@
         <w:tc>
           <w:tcPr>
             <w:tcW w:type="dxa" w:w="2880"/>
+            <w:shd w:fill="F2F2F2"/>
             <w:tcMar>
               <w:top w:w="60" w:type="dxa"/>
               <w:bottom w:w="60" w:type="dxa"/>
               <w:left w:w="100" w:type="dxa"/>
               <w:right w:w="100" w:type="dxa"/>
             </w:tcMar>
-            <w:shd w:fill="F2F2F2"/>
           </w:tcPr>
           <w:p>
             <w:pPr>
@@ -2109,13 +2109,13 @@
         <w:tc>
           <w:tcPr>
             <w:tcW w:type="dxa" w:w="3168"/>
+            <w:shd w:fill="F2F2F2"/>
             <w:tcMar>
               <w:top w:w="60" w:type="dxa"/>
               <w:bottom w:w="60" w:type="dxa"/>
               <w:left w:w="100" w:type="dxa"/>
               <w:right w:w="100" w:type="dxa"/>
             </w:tcMar>
-            <w:shd w:fill="F2F2F2"/>
           </w:tcPr>
           <w:p>
             <w:pPr>
@@ -2133,13 +2133,13 @@
         <w:tc>
           <w:tcPr>
             <w:tcW w:type="dxa" w:w="3456"/>
+            <w:shd w:fill="F2F2F2"/>
             <w:tcMar>
               <w:top w:w="60" w:type="dxa"/>
               <w:bottom w:w="60" w:type="dxa"/>
               <w:left w:w="100" w:type="dxa"/>
               <w:right w:w="100" w:type="dxa"/>
             </w:tcMar>
-            <w:shd w:fill="F2F2F2"/>
           </w:tcPr>
           <w:p>
             <w:pPr>
@@ -2770,7 +2770,7 @@
     </w:tbl>
     <w:p>
       <w:pPr>
-        <w:spacing w:before="320" w:after="160"/>
+        <w:spacing w:before="280" w:after="160"/>
         <w:jc w:val="center"/>
       </w:pPr>
       <w:r>
@@ -2785,7 +2785,6 @@
       <w:tblPr>
         <w:tblW w:type="auto" w:w="0"/>
         <w:jc w:val="center"/>
-        <w:tblLook w:firstColumn="1" w:firstRow="1" w:lastColumn="0" w:lastRow="0" w:noHBand="0" w:noVBand="1" w:val="04A0"/>
         <w:tblBorders>
           <w:top w:val="single" w:sz="4" w:space="0" w:color="000000"/>
           <w:left w:val="single" w:sz="4" w:space="0" w:color="000000"/>
@@ -2794,6 +2793,7 @@
           <w:insideH w:val="single" w:sz="4" w:space="0" w:color="000000"/>
           <w:insideV w:val="single" w:sz="4" w:space="0" w:color="000000"/>
         </w:tblBorders>
+        <w:tblLook w:firstColumn="1" w:firstRow="1" w:lastColumn="0" w:lastRow="0" w:noHBand="0" w:noVBand="1" w:val="04A0"/>
       </w:tblPr>
       <w:tblGrid>
         <w:gridCol w:w="3202"/>
@@ -2804,13 +2804,13 @@
         <w:tc>
           <w:tcPr>
             <w:tcW w:type="dxa" w:w="2880"/>
+            <w:shd w:fill="F2F2F2"/>
             <w:tcMar>
               <w:top w:w="60" w:type="dxa"/>
               <w:bottom w:w="60" w:type="dxa"/>
               <w:left w:w="100" w:type="dxa"/>
               <w:right w:w="100" w:type="dxa"/>
             </w:tcMar>
-            <w:shd w:fill="F2F2F2"/>
           </w:tcPr>
           <w:p>
             <w:pPr>
@@ -2828,13 +2828,13 @@
         <w:tc>
           <w:tcPr>
             <w:tcW w:type="dxa" w:w="3168"/>
+            <w:shd w:fill="F2F2F2"/>
             <w:tcMar>
               <w:top w:w="60" w:type="dxa"/>
               <w:bottom w:w="60" w:type="dxa"/>
               <w:left w:w="100" w:type="dxa"/>
               <w:right w:w="100" w:type="dxa"/>
             </w:tcMar>
-            <w:shd w:fill="F2F2F2"/>
           </w:tcPr>
           <w:p>
             <w:pPr>
@@ -2852,13 +2852,13 @@
         <w:tc>
           <w:tcPr>
             <w:tcW w:type="dxa" w:w="3456"/>
+            <w:shd w:fill="F2F2F2"/>
             <w:tcMar>
               <w:top w:w="60" w:type="dxa"/>
               <w:bottom w:w="60" w:type="dxa"/>
               <w:left w:w="100" w:type="dxa"/>
               <w:right w:w="100" w:type="dxa"/>
             </w:tcMar>
-            <w:shd w:fill="F2F2F2"/>
           </w:tcPr>
           <w:p>
             <w:pPr>
@@ -3494,7 +3494,7 @@
     </w:p>
     <w:p>
       <w:pPr>
-        <w:spacing w:before="120" w:after="240"/>
+        <w:spacing w:before="80" w:after="240"/>
         <w:jc w:val="center"/>
       </w:pPr>
       <w:r>
@@ -3510,7 +3510,6 @@
       <w:tblPr>
         <w:tblW w:type="auto" w:w="0"/>
         <w:jc w:val="center"/>
-        <w:tblLook w:firstColumn="1" w:firstRow="1" w:lastColumn="0" w:lastRow="0" w:noHBand="0" w:noVBand="1" w:val="04A0"/>
         <w:tblBorders>
           <w:top w:val="single" w:sz="4" w:space="0" w:color="000000"/>
           <w:left w:val="single" w:sz="4" w:space="0" w:color="000000"/>
@@ -3519,6 +3518,7 @@
           <w:insideH w:val="single" w:sz="4" w:space="0" w:color="000000"/>
           <w:insideV w:val="single" w:sz="4" w:space="0" w:color="000000"/>
         </w:tblBorders>
+        <w:tblLook w:firstColumn="1" w:firstRow="1" w:lastColumn="0" w:lastRow="0" w:noHBand="0" w:noVBand="1" w:val="04A0"/>
       </w:tblPr>
       <w:tblGrid>
         <w:gridCol w:w="2401"/>
@@ -3530,13 +3530,13 @@
         <w:tc>
           <w:tcPr>
             <w:tcW w:type="dxa" w:w="2016"/>
+            <w:shd w:fill="F2F2F2"/>
             <w:tcMar>
               <w:top w:w="60" w:type="dxa"/>
               <w:bottom w:w="60" w:type="dxa"/>
               <w:left w:w="80" w:type="dxa"/>
               <w:right w:w="80" w:type="dxa"/>
             </w:tcMar>
-            <w:shd w:fill="F2F2F2"/>
           </w:tcPr>
           <w:p>
             <w:pPr>
@@ -3554,13 +3554,13 @@
         <w:tc>
           <w:tcPr>
             <w:tcW w:type="dxa" w:w="3456"/>
+            <w:shd w:fill="F2F2F2"/>
             <w:tcMar>
               <w:top w:w="60" w:type="dxa"/>
               <w:bottom w:w="60" w:type="dxa"/>
               <w:left w:w="80" w:type="dxa"/>
               <w:right w:w="80" w:type="dxa"/>
             </w:tcMar>
-            <w:shd w:fill="F2F2F2"/>
           </w:tcPr>
           <w:p>
             <w:pPr>
@@ -3578,13 +3578,13 @@
         <w:tc>
           <w:tcPr>
             <w:tcW w:type="dxa" w:w="3168"/>
+            <w:shd w:fill="F2F2F2"/>
             <w:tcMar>
               <w:top w:w="60" w:type="dxa"/>
               <w:bottom w:w="60" w:type="dxa"/>
               <w:left w:w="80" w:type="dxa"/>
               <w:right w:w="80" w:type="dxa"/>
             </w:tcMar>
-            <w:shd w:fill="F2F2F2"/>
           </w:tcPr>
           <w:p>
             <w:pPr>
@@ -3602,13 +3602,13 @@
         <w:tc>
           <w:tcPr>
             <w:tcW w:type="dxa" w:w="864"/>
+            <w:shd w:fill="F2F2F2"/>
             <w:tcMar>
               <w:top w:w="60" w:type="dxa"/>
               <w:bottom w:w="60" w:type="dxa"/>
               <w:left w:w="80" w:type="dxa"/>
               <w:right w:w="80" w:type="dxa"/>
             </w:tcMar>
-            <w:shd w:fill="F2F2F2"/>
           </w:tcPr>
           <w:p>
             <w:pPr>
@@ -4543,7 +4543,7 @@
     </w:p>
     <w:p>
       <w:pPr>
-        <w:spacing w:before="120" w:after="160"/>
+        <w:spacing w:before="80" w:after="160"/>
         <w:jc w:val="center"/>
       </w:pPr>
       <w:r>
@@ -4571,13 +4571,13 @@
     </w:p>
     <w:p>
       <w:pPr>
-        <w:spacing w:after="280"/>
+        <w:spacing w:after="240"/>
         <w:jc w:val="center"/>
       </w:pPr>
       <w:r>
         <w:drawing>
           <wp:inline xmlns:a="http://schemas.openxmlformats.org/drawingml/2006/main" xmlns:pic="http://schemas.openxmlformats.org/drawingml/2006/picture">
-            <wp:extent cx="5852160" cy="3290233"/>
+            <wp:extent cx="5486400" cy="3084594"/>
             <wp:docPr id="4" name="Picture 4"/>
             <wp:cNvGraphicFramePr>
               <a:graphicFrameLocks noChangeAspect="1"/>
@@ -4598,7 +4598,7 @@
                   <pic:spPr>
                     <a:xfrm>
                       <a:off x="0" y="0"/>
-                      <a:ext cx="5852160" cy="3290233"/>
+                      <a:ext cx="5486400" cy="3084594"/>
                     </a:xfrm>
                     <a:prstGeom prst="rect"/>
                   </pic:spPr>
@@ -4684,13 +4684,13 @@
     </w:p>
     <w:p>
       <w:pPr>
-        <w:spacing w:after="280"/>
+        <w:spacing w:after="240"/>
         <w:jc w:val="center"/>
       </w:pPr>
       <w:r>
         <w:drawing>
           <wp:inline xmlns:a="http://schemas.openxmlformats.org/drawingml/2006/main" xmlns:pic="http://schemas.openxmlformats.org/drawingml/2006/picture">
-            <wp:extent cx="5852160" cy="3290233"/>
+            <wp:extent cx="5486400" cy="3084594"/>
             <wp:docPr id="5" name="Picture 5"/>
             <wp:cNvGraphicFramePr>
               <a:graphicFrameLocks noChangeAspect="1"/>
@@ -4711,7 +4711,7 @@
                   <pic:spPr>
                     <a:xfrm>
                       <a:off x="0" y="0"/>
-                      <a:ext cx="5852160" cy="3290233"/>
+                      <a:ext cx="5486400" cy="3084594"/>
                     </a:xfrm>
                     <a:prstGeom prst="rect"/>
                   </pic:spPr>
@@ -4797,13 +4797,13 @@
     </w:p>
     <w:p>
       <w:pPr>
-        <w:spacing w:after="280"/>
+        <w:spacing w:after="240"/>
         <w:jc w:val="center"/>
       </w:pPr>
       <w:r>
         <w:drawing>
           <wp:inline xmlns:a="http://schemas.openxmlformats.org/drawingml/2006/main" xmlns:pic="http://schemas.openxmlformats.org/drawingml/2006/picture">
-            <wp:extent cx="5852160" cy="3290233"/>
+            <wp:extent cx="5486400" cy="3084594"/>
             <wp:docPr id="6" name="Picture 6"/>
             <wp:cNvGraphicFramePr>
               <a:graphicFrameLocks noChangeAspect="1"/>
@@ -4824,7 +4824,7 @@
                   <pic:spPr>
                     <a:xfrm>
                       <a:off x="0" y="0"/>
-                      <a:ext cx="5852160" cy="3290233"/>
+                      <a:ext cx="5486400" cy="3084594"/>
                     </a:xfrm>
                     <a:prstGeom prst="rect"/>
                   </pic:spPr>
@@ -4910,13 +4910,13 @@
     </w:p>
     <w:p>
       <w:pPr>
-        <w:spacing w:after="280"/>
+        <w:spacing w:after="240"/>
         <w:jc w:val="center"/>
       </w:pPr>
       <w:r>
         <w:drawing>
           <wp:inline xmlns:a="http://schemas.openxmlformats.org/drawingml/2006/main" xmlns:pic="http://schemas.openxmlformats.org/drawingml/2006/picture">
-            <wp:extent cx="5852160" cy="3290233"/>
+            <wp:extent cx="5486400" cy="3084594"/>
             <wp:docPr id="7" name="Picture 7"/>
             <wp:cNvGraphicFramePr>
               <a:graphicFrameLocks noChangeAspect="1"/>
@@ -4937,7 +4937,7 @@
                   <pic:spPr>
                     <a:xfrm>
                       <a:off x="0" y="0"/>
-                      <a:ext cx="5852160" cy="3290233"/>
+                      <a:ext cx="5486400" cy="3084594"/>
                     </a:xfrm>
                     <a:prstGeom prst="rect"/>
                   </pic:spPr>
@@ -5023,13 +5023,13 @@
     </w:p>
     <w:p>
       <w:pPr>
-        <w:spacing w:after="280"/>
+        <w:spacing w:after="240"/>
         <w:jc w:val="center"/>
       </w:pPr>
       <w:r>
         <w:drawing>
           <wp:inline xmlns:a="http://schemas.openxmlformats.org/drawingml/2006/main" xmlns:pic="http://schemas.openxmlformats.org/drawingml/2006/picture">
-            <wp:extent cx="5852160" cy="3290233"/>
+            <wp:extent cx="5486400" cy="3084594"/>
             <wp:docPr id="8" name="Picture 8"/>
             <wp:cNvGraphicFramePr>
               <a:graphicFrameLocks noChangeAspect="1"/>
@@ -5050,7 +5050,7 @@
                   <pic:spPr>
                     <a:xfrm>
                       <a:off x="0" y="0"/>
-                      <a:ext cx="5852160" cy="3290233"/>
+                      <a:ext cx="5486400" cy="3084594"/>
                     </a:xfrm>
                     <a:prstGeom prst="rect"/>
                   </pic:spPr>
@@ -5136,13 +5136,13 @@
     </w:p>
     <w:p>
       <w:pPr>
-        <w:spacing w:after="280"/>
+        <w:spacing w:after="240"/>
         <w:jc w:val="center"/>
       </w:pPr>
       <w:r>
         <w:drawing>
           <wp:inline xmlns:a="http://schemas.openxmlformats.org/drawingml/2006/main" xmlns:pic="http://schemas.openxmlformats.org/drawingml/2006/picture">
-            <wp:extent cx="5852160" cy="3290233"/>
+            <wp:extent cx="5486400" cy="3084594"/>
             <wp:docPr id="9" name="Picture 9"/>
             <wp:cNvGraphicFramePr>
               <a:graphicFrameLocks noChangeAspect="1"/>
@@ -5163,7 +5163,7 @@
                   <pic:spPr>
                     <a:xfrm>
                       <a:off x="0" y="0"/>
-                      <a:ext cx="5852160" cy="3290233"/>
+                      <a:ext cx="5486400" cy="3084594"/>
                     </a:xfrm>
                     <a:prstGeom prst="rect"/>
                   </pic:spPr>
@@ -5249,13 +5249,13 @@
     </w:p>
     <w:p>
       <w:pPr>
-        <w:spacing w:after="280"/>
+        <w:spacing w:after="240"/>
         <w:jc w:val="center"/>
       </w:pPr>
       <w:r>
         <w:drawing>
           <wp:inline xmlns:a="http://schemas.openxmlformats.org/drawingml/2006/main" xmlns:pic="http://schemas.openxmlformats.org/drawingml/2006/picture">
-            <wp:extent cx="5852160" cy="3290233"/>
+            <wp:extent cx="5486400" cy="3084594"/>
             <wp:docPr id="10" name="Picture 10"/>
             <wp:cNvGraphicFramePr>
               <a:graphicFrameLocks noChangeAspect="1"/>
@@ -5276,7 +5276,7 @@
                   <pic:spPr>
                     <a:xfrm>
                       <a:off x="0" y="0"/>
-                      <a:ext cx="5852160" cy="3290233"/>
+                      <a:ext cx="5486400" cy="3084594"/>
                     </a:xfrm>
                     <a:prstGeom prst="rect"/>
                   </pic:spPr>
@@ -5362,13 +5362,13 @@
     </w:p>
     <w:p>
       <w:pPr>
-        <w:spacing w:after="280"/>
+        <w:spacing w:after="240"/>
         <w:jc w:val="center"/>
       </w:pPr>
       <w:r>
         <w:drawing>
           <wp:inline xmlns:a="http://schemas.openxmlformats.org/drawingml/2006/main" xmlns:pic="http://schemas.openxmlformats.org/drawingml/2006/picture">
-            <wp:extent cx="5852160" cy="3290233"/>
+            <wp:extent cx="5486400" cy="3084594"/>
             <wp:docPr id="11" name="Picture 11"/>
             <wp:cNvGraphicFramePr>
               <a:graphicFrameLocks noChangeAspect="1"/>
@@ -5389,7 +5389,7 @@
                   <pic:spPr>
                     <a:xfrm>
                       <a:off x="0" y="0"/>
-                      <a:ext cx="5852160" cy="3290233"/>
+                      <a:ext cx="5486400" cy="3084594"/>
                     </a:xfrm>
                     <a:prstGeom prst="rect"/>
                   </pic:spPr>
@@ -5475,13 +5475,13 @@
     </w:p>
     <w:p>
       <w:pPr>
-        <w:spacing w:after="280"/>
+        <w:spacing w:after="240"/>
         <w:jc w:val="center"/>
       </w:pPr>
       <w:r>
         <w:drawing>
           <wp:inline xmlns:a="http://schemas.openxmlformats.org/drawingml/2006/main" xmlns:pic="http://schemas.openxmlformats.org/drawingml/2006/picture">
-            <wp:extent cx="5852160" cy="2779776"/>
+            <wp:extent cx="5486400" cy="2606040"/>
             <wp:docPr id="12" name="Picture 12"/>
             <wp:cNvGraphicFramePr>
               <a:graphicFrameLocks noChangeAspect="1"/>
@@ -5502,7 +5502,7 @@
                   <pic:spPr>
                     <a:xfrm>
                       <a:off x="0" y="0"/>
-                      <a:ext cx="5852160" cy="2779776"/>
+                      <a:ext cx="5486400" cy="2606040"/>
                     </a:xfrm>
                     <a:prstGeom prst="rect"/>
                   </pic:spPr>
@@ -5588,13 +5588,13 @@
     </w:p>
     <w:p>
       <w:pPr>
-        <w:spacing w:after="280"/>
+        <w:spacing w:after="240"/>
         <w:jc w:val="center"/>
       </w:pPr>
       <w:r>
         <w:drawing>
           <wp:inline xmlns:a="http://schemas.openxmlformats.org/drawingml/2006/main" xmlns:pic="http://schemas.openxmlformats.org/drawingml/2006/picture">
-            <wp:extent cx="5852160" cy="2779776"/>
+            <wp:extent cx="5486400" cy="2606040"/>
             <wp:docPr id="13" name="Picture 13"/>
             <wp:cNvGraphicFramePr>
               <a:graphicFrameLocks noChangeAspect="1"/>
@@ -5615,7 +5615,7 @@
                   <pic:spPr>
                     <a:xfrm>
                       <a:off x="0" y="0"/>
-                      <a:ext cx="5852160" cy="2779776"/>
+                      <a:ext cx="5486400" cy="2606040"/>
                     </a:xfrm>
                     <a:prstGeom prst="rect"/>
                   </pic:spPr>
@@ -5701,13 +5701,13 @@
     </w:p>
     <w:p>
       <w:pPr>
-        <w:spacing w:after="280"/>
+        <w:spacing w:after="240"/>
         <w:jc w:val="center"/>
       </w:pPr>
       <w:r>
         <w:drawing>
           <wp:inline xmlns:a="http://schemas.openxmlformats.org/drawingml/2006/main" xmlns:pic="http://schemas.openxmlformats.org/drawingml/2006/picture">
-            <wp:extent cx="5852160" cy="2779776"/>
+            <wp:extent cx="5486400" cy="2606040"/>
             <wp:docPr id="14" name="Picture 14"/>
             <wp:cNvGraphicFramePr>
               <a:graphicFrameLocks noChangeAspect="1"/>
@@ -5728,7 +5728,7 @@
                   <pic:spPr>
                     <a:xfrm>
                       <a:off x="0" y="0"/>
-                      <a:ext cx="5852160" cy="2779776"/>
+                      <a:ext cx="5486400" cy="2606040"/>
                     </a:xfrm>
                     <a:prstGeom prst="rect"/>
                   </pic:spPr>
@@ -5814,13 +5814,13 @@
     </w:p>
     <w:p>
       <w:pPr>
-        <w:spacing w:after="280"/>
+        <w:spacing w:after="240"/>
         <w:jc w:val="center"/>
       </w:pPr>
       <w:r>
         <w:drawing>
           <wp:inline xmlns:a="http://schemas.openxmlformats.org/drawingml/2006/main" xmlns:pic="http://schemas.openxmlformats.org/drawingml/2006/picture">
-            <wp:extent cx="5852160" cy="3290233"/>
+            <wp:extent cx="5486400" cy="3084594"/>
             <wp:docPr id="15" name="Picture 15"/>
             <wp:cNvGraphicFramePr>
               <a:graphicFrameLocks noChangeAspect="1"/>
@@ -5841,7 +5841,7 @@
                   <pic:spPr>
                     <a:xfrm>
                       <a:off x="0" y="0"/>
-                      <a:ext cx="5852160" cy="3290233"/>
+                      <a:ext cx="5486400" cy="3084594"/>
                     </a:xfrm>
                     <a:prstGeom prst="rect"/>
                   </pic:spPr>
@@ -5927,13 +5927,13 @@
     </w:p>
     <w:p>
       <w:pPr>
-        <w:spacing w:after="280"/>
+        <w:spacing w:after="240"/>
         <w:jc w:val="center"/>
       </w:pPr>
       <w:r>
         <w:drawing>
           <wp:inline xmlns:a="http://schemas.openxmlformats.org/drawingml/2006/main" xmlns:pic="http://schemas.openxmlformats.org/drawingml/2006/picture">
-            <wp:extent cx="5852160" cy="3290233"/>
+            <wp:extent cx="5486400" cy="3084594"/>
             <wp:docPr id="16" name="Picture 16"/>
             <wp:cNvGraphicFramePr>
               <a:graphicFrameLocks noChangeAspect="1"/>
@@ -5954,7 +5954,7 @@
                   <pic:spPr>
                     <a:xfrm>
                       <a:off x="0" y="0"/>
-                      <a:ext cx="5852160" cy="3290233"/>
+                      <a:ext cx="5486400" cy="3084594"/>
                     </a:xfrm>
                     <a:prstGeom prst="rect"/>
                   </pic:spPr>
@@ -6040,13 +6040,13 @@
     </w:p>
     <w:p>
       <w:pPr>
-        <w:spacing w:after="280"/>
+        <w:spacing w:after="240"/>
         <w:jc w:val="center"/>
       </w:pPr>
       <w:r>
         <w:drawing>
           <wp:inline xmlns:a="http://schemas.openxmlformats.org/drawingml/2006/main" xmlns:pic="http://schemas.openxmlformats.org/drawingml/2006/picture">
-            <wp:extent cx="5852160" cy="3290233"/>
+            <wp:extent cx="5486400" cy="3084594"/>
             <wp:docPr id="17" name="Picture 17"/>
             <wp:cNvGraphicFramePr>
               <a:graphicFrameLocks noChangeAspect="1"/>
@@ -6067,7 +6067,7 @@
                   <pic:spPr>
                     <a:xfrm>
                       <a:off x="0" y="0"/>
-                      <a:ext cx="5852160" cy="3290233"/>
+                      <a:ext cx="5486400" cy="3084594"/>
                     </a:xfrm>
                     <a:prstGeom prst="rect"/>
                   </pic:spPr>
@@ -6153,13 +6153,13 @@
     </w:p>
     <w:p>
       <w:pPr>
-        <w:spacing w:after="280"/>
+        <w:spacing w:after="240"/>
         <w:jc w:val="center"/>
       </w:pPr>
       <w:r>
         <w:drawing>
           <wp:inline xmlns:a="http://schemas.openxmlformats.org/drawingml/2006/main" xmlns:pic="http://schemas.openxmlformats.org/drawingml/2006/picture">
-            <wp:extent cx="5852160" cy="3290233"/>
+            <wp:extent cx="5486400" cy="3084594"/>
             <wp:docPr id="18" name="Picture 18"/>
             <wp:cNvGraphicFramePr>
               <a:graphicFrameLocks noChangeAspect="1"/>
@@ -6180,7 +6180,7 @@
                   <pic:spPr>
                     <a:xfrm>
                       <a:off x="0" y="0"/>
-                      <a:ext cx="5852160" cy="3290233"/>
+                      <a:ext cx="5486400" cy="3084594"/>
                     </a:xfrm>
                     <a:prstGeom prst="rect"/>
                   </pic:spPr>
@@ -6266,13 +6266,13 @@
     </w:p>
     <w:p>
       <w:pPr>
-        <w:spacing w:after="280"/>
+        <w:spacing w:after="240"/>
         <w:jc w:val="center"/>
       </w:pPr>
       <w:r>
         <w:drawing>
           <wp:inline xmlns:a="http://schemas.openxmlformats.org/drawingml/2006/main" xmlns:pic="http://schemas.openxmlformats.org/drawingml/2006/picture">
-            <wp:extent cx="5852160" cy="3290233"/>
+            <wp:extent cx="5486400" cy="3084594"/>
             <wp:docPr id="19" name="Picture 19"/>
             <wp:cNvGraphicFramePr>
               <a:graphicFrameLocks noChangeAspect="1"/>
@@ -6293,7 +6293,7 @@
                   <pic:spPr>
                     <a:xfrm>
                       <a:off x="0" y="0"/>
-                      <a:ext cx="5852160" cy="3290233"/>
+                      <a:ext cx="5486400" cy="3084594"/>
                     </a:xfrm>
                     <a:prstGeom prst="rect"/>
                   </pic:spPr>
@@ -6379,13 +6379,13 @@
     </w:p>
     <w:p>
       <w:pPr>
-        <w:spacing w:after="280"/>
+        <w:spacing w:after="240"/>
         <w:jc w:val="center"/>
       </w:pPr>
       <w:r>
         <w:drawing>
           <wp:inline xmlns:a="http://schemas.openxmlformats.org/drawingml/2006/main" xmlns:pic="http://schemas.openxmlformats.org/drawingml/2006/picture">
-            <wp:extent cx="5852160" cy="3290233"/>
+            <wp:extent cx="5486400" cy="3084594"/>
             <wp:docPr id="20" name="Picture 20"/>
             <wp:cNvGraphicFramePr>
               <a:graphicFrameLocks noChangeAspect="1"/>
@@ -6406,7 +6406,7 @@
                   <pic:spPr>
                     <a:xfrm>
                       <a:off x="0" y="0"/>
-                      <a:ext cx="5852160" cy="3290233"/>
+                      <a:ext cx="5486400" cy="3084594"/>
                     </a:xfrm>
                     <a:prstGeom prst="rect"/>
                   </pic:spPr>
@@ -6492,13 +6492,13 @@
     </w:p>
     <w:p>
       <w:pPr>
-        <w:spacing w:after="280"/>
+        <w:spacing w:after="240"/>
         <w:jc w:val="center"/>
       </w:pPr>
       <w:r>
         <w:drawing>
           <wp:inline xmlns:a="http://schemas.openxmlformats.org/drawingml/2006/main" xmlns:pic="http://schemas.openxmlformats.org/drawingml/2006/picture">
-            <wp:extent cx="5852160" cy="3290233"/>
+            <wp:extent cx="5486400" cy="3084594"/>
             <wp:docPr id="21" name="Picture 21"/>
             <wp:cNvGraphicFramePr>
               <a:graphicFrameLocks noChangeAspect="1"/>
@@ -6519,7 +6519,7 @@
                   <pic:spPr>
                     <a:xfrm>
                       <a:off x="0" y="0"/>
-                      <a:ext cx="5852160" cy="3290233"/>
+                      <a:ext cx="5486400" cy="3084594"/>
                     </a:xfrm>
                     <a:prstGeom prst="rect"/>
                   </pic:spPr>
@@ -6605,13 +6605,13 @@
     </w:p>
     <w:p>
       <w:pPr>
-        <w:spacing w:after="280"/>
+        <w:spacing w:after="240"/>
         <w:jc w:val="center"/>
       </w:pPr>
       <w:r>
         <w:drawing>
           <wp:inline xmlns:a="http://schemas.openxmlformats.org/drawingml/2006/main" xmlns:pic="http://schemas.openxmlformats.org/drawingml/2006/picture">
-            <wp:extent cx="5852160" cy="3290233"/>
+            <wp:extent cx="5486400" cy="3084594"/>
             <wp:docPr id="22" name="Picture 22"/>
             <wp:cNvGraphicFramePr>
               <a:graphicFrameLocks noChangeAspect="1"/>
@@ -6632,7 +6632,7 @@
                   <pic:spPr>
                     <a:xfrm>
                       <a:off x="0" y="0"/>
-                      <a:ext cx="5852160" cy="3290233"/>
+                      <a:ext cx="5486400" cy="3084594"/>
                     </a:xfrm>
                     <a:prstGeom prst="rect"/>
                   </pic:spPr>
@@ -6718,13 +6718,13 @@
     </w:p>
     <w:p>
       <w:pPr>
-        <w:spacing w:after="280"/>
+        <w:spacing w:after="240"/>
         <w:jc w:val="center"/>
       </w:pPr>
       <w:r>
         <w:drawing>
           <wp:inline xmlns:a="http://schemas.openxmlformats.org/drawingml/2006/main" xmlns:pic="http://schemas.openxmlformats.org/drawingml/2006/picture">
-            <wp:extent cx="5852160" cy="3290233"/>
+            <wp:extent cx="5486400" cy="3084594"/>
             <wp:docPr id="23" name="Picture 23"/>
             <wp:cNvGraphicFramePr>
               <a:graphicFrameLocks noChangeAspect="1"/>
@@ -6745,7 +6745,7 @@
                   <pic:spPr>
                     <a:xfrm>
                       <a:off x="0" y="0"/>
-                      <a:ext cx="5852160" cy="3290233"/>
+                      <a:ext cx="5486400" cy="3084594"/>
                     </a:xfrm>
                     <a:prstGeom prst="rect"/>
                   </pic:spPr>
@@ -6831,13 +6831,13 @@
     </w:p>
     <w:p>
       <w:pPr>
-        <w:spacing w:after="280"/>
+        <w:spacing w:after="240"/>
         <w:jc w:val="center"/>
       </w:pPr>
       <w:r>
         <w:drawing>
           <wp:inline xmlns:a="http://schemas.openxmlformats.org/drawingml/2006/main" xmlns:pic="http://schemas.openxmlformats.org/drawingml/2006/picture">
-            <wp:extent cx="5852160" cy="3290233"/>
+            <wp:extent cx="5486400" cy="3084594"/>
             <wp:docPr id="24" name="Picture 24"/>
             <wp:cNvGraphicFramePr>
               <a:graphicFrameLocks noChangeAspect="1"/>
@@ -6858,7 +6858,7 @@
                   <pic:spPr>
                     <a:xfrm>
                       <a:off x="0" y="0"/>
-                      <a:ext cx="5852160" cy="3290233"/>
+                      <a:ext cx="5486400" cy="3084594"/>
                     </a:xfrm>
                     <a:prstGeom prst="rect"/>
                   </pic:spPr>
@@ -6930,7 +6930,7 @@
     </w:p>
     <w:p>
       <w:pPr>
-        <w:spacing w:before="120" w:after="480"/>
+        <w:spacing w:before="80" w:after="480"/>
         <w:jc w:val="center"/>
       </w:pPr>
       <w:r>
@@ -7057,7 +7057,7 @@
     </w:p>
     <w:p>
       <w:pPr>
-        <w:spacing w:before="120" w:after="560"/>
+        <w:spacing w:before="80" w:after="560"/>
         <w:jc w:val="center"/>
       </w:pPr>
       <w:r>
@@ -7169,14 +7169,14 @@
       <w:footerReference w:type="default" r:id="rId10"/>
       <w:pgSz w:w="11909" w:h="16834"/>
       <w:pgMar w:top="1152" w:right="1152" w:bottom="1152" w:left="1152" w:header="720" w:footer="720" w:gutter="0"/>
-      <w:cols w:space="720"/>
-      <w:docGrid w:linePitch="360"/>
       <w:pgBorders w:offsetFrom="page">
         <w:top w:val="double" w:sz="18" w:space="24" w:color="000000"/>
         <w:left w:val="double" w:sz="18" w:space="24" w:color="000000"/>
         <w:bottom w:val="double" w:sz="18" w:space="24" w:color="000000"/>
         <w:right w:val="double" w:sz="18" w:space="24" w:color="000000"/>
       </w:pgBorders>
+      <w:cols w:space="720"/>
+      <w:docGrid w:linePitch="360"/>
     </w:sectPr>
   </w:body>
 </w:document>

</xml_diff>

<commit_message>
Replace screenshots with fully authenticated admin views across all report pages
</commit_message>
<xml_diff>
--- a/Fenix_IT_Mall_Project_Report.docx
+++ b/Fenix_IT_Mall_Project_Report.docx
@@ -4812,120 +4812,7 @@
               <a:graphicData uri="http://schemas.openxmlformats.org/drawingml/2006/picture">
                 <pic:pic>
                   <pic:nvPicPr>
-                    <pic:cNvPr id="0" name="screen_01_login.png"/>
-                    <pic:cNvPicPr/>
-                  </pic:nvPicPr>
-                  <pic:blipFill>
-                    <a:blip r:embed="rId14"/>
-                    <a:stretch>
-                      <a:fillRect/>
-                    </a:stretch>
-                  </pic:blipFill>
-                  <pic:spPr>
-                    <a:xfrm>
-                      <a:off x="0" y="0"/>
-                      <a:ext cx="5486400" cy="3084594"/>
-                    </a:xfrm>
-                    <a:prstGeom prst="rect"/>
-                  </pic:spPr>
-                </pic:pic>
-              </a:graphicData>
-            </a:graphic>
-          </wp:inline>
-        </w:drawing>
-      </w:r>
-    </w:p>
-    <w:p>
-      <w:pPr>
-        <w:spacing w:after="140" w:line="340" w:lineRule="exact"/>
-      </w:pPr>
-      <w:r>
-        <w:rPr>
-          <w:rFonts w:ascii="Segoe UI Symbol" w:hAnsi="Segoe UI Symbol"/>
-          <w:sz w:val="23"/>
-        </w:rPr>
-        <w:t xml:space="preserve">➢ </w:t>
-      </w:r>
-      <w:r>
-        <w:rPr>
-          <w:sz w:val="23"/>
-        </w:rPr>
-        <w:t>This is the user management and staff directory page of the website.</w:t>
-      </w:r>
-    </w:p>
-    <w:p>
-      <w:pPr>
-        <w:spacing w:after="140" w:line="340" w:lineRule="exact"/>
-      </w:pPr>
-      <w:r>
-        <w:rPr>
-          <w:rFonts w:ascii="Segoe UI Symbol" w:hAnsi="Segoe UI Symbol"/>
-          <w:sz w:val="23"/>
-        </w:rPr>
-        <w:t xml:space="preserve">➢ </w:t>
-      </w:r>
-      <w:r>
-        <w:rPr>
-          <w:sz w:val="23"/>
-        </w:rPr>
-        <w:t>Admin can view all registered staff members with their role tags and active status.</w:t>
-      </w:r>
-    </w:p>
-    <w:p>
-      <w:pPr>
-        <w:spacing w:after="140" w:line="340" w:lineRule="exact"/>
-      </w:pPr>
-      <w:r>
-        <w:rPr>
-          <w:rFonts w:ascii="Segoe UI Symbol" w:hAnsi="Segoe UI Symbol"/>
-          <w:sz w:val="23"/>
-        </w:rPr>
-        <w:t xml:space="preserve">➢ </w:t>
-      </w:r>
-      <w:r>
-        <w:rPr>
-          <w:sz w:val="23"/>
-        </w:rPr>
-        <w:t>Provides secure administrative controls to manage accounts and user privileges.</w:t>
-      </w:r>
-    </w:p>
-    <w:p>
-      <w:r>
-        <w:br w:type="page"/>
-      </w:r>
-    </w:p>
-    <w:p>
-      <w:pPr>
-        <w:spacing w:before="80" w:after="160"/>
-        <w:jc w:val="left"/>
-      </w:pPr>
-      <w:r>
-        <w:rPr>
-          <w:b/>
-          <w:sz w:val="28"/>
-          <w:u w:val="single"/>
-        </w:rPr>
-        <w:t>Admin Password Change Page:</w:t>
-      </w:r>
-    </w:p>
-    <w:p>
-      <w:pPr>
-        <w:spacing w:after="240"/>
-        <w:jc w:val="center"/>
-      </w:pPr>
-      <w:r>
-        <w:drawing>
-          <wp:inline xmlns:a="http://schemas.openxmlformats.org/drawingml/2006/main" xmlns:pic="http://schemas.openxmlformats.org/drawingml/2006/picture">
-            <wp:extent cx="5486400" cy="3084594"/>
-            <wp:docPr id="7" name="Picture 7"/>
-            <wp:cNvGraphicFramePr>
-              <a:graphicFrameLocks noChangeAspect="1"/>
-            </wp:cNvGraphicFramePr>
-            <a:graphic>
-              <a:graphicData uri="http://schemas.openxmlformats.org/drawingml/2006/picture">
-                <pic:pic>
-                  <pic:nvPicPr>
-                    <pic:cNvPr id="0" name="screen_06_admin_pwd.png"/>
+                    <pic:cNvPr id="0" name="screen_05_user_list.png"/>
                     <pic:cNvPicPr/>
                   </pic:nvPicPr>
                   <pic:blipFill>
@@ -4963,7 +4850,7 @@
         <w:rPr>
           <w:sz w:val="23"/>
         </w:rPr>
-        <w:t>This is the admin password override page of the website.</w:t>
+        <w:t>This is the user management and staff directory page of the website.</w:t>
       </w:r>
     </w:p>
     <w:p>
@@ -4981,7 +4868,7 @@
         <w:rPr>
           <w:sz w:val="23"/>
         </w:rPr>
-        <w:t>Super Admin can securely reset passwords for cashiers, managers, and employees.</w:t>
+        <w:t>Admin can view all registered staff members with their role tags and active status.</w:t>
       </w:r>
     </w:p>
     <w:p>
@@ -4999,7 +4886,7 @@
         <w:rPr>
           <w:sz w:val="23"/>
         </w:rPr>
-        <w:t>Ensures strict identity verification and business data protection.</w:t>
+        <w:t>Provides secure administrative controls to manage accounts and user privileges.</w:t>
       </w:r>
     </w:p>
     <w:p>
@@ -5018,7 +4905,7 @@
           <w:sz w:val="28"/>
           <w:u w:val="single"/>
         </w:rPr>
-        <w:t>Profile Page:</w:t>
+        <w:t>Admin Password Change Page:</w:t>
       </w:r>
     </w:p>
     <w:p>
@@ -5030,7 +4917,7 @@
         <w:drawing>
           <wp:inline xmlns:a="http://schemas.openxmlformats.org/drawingml/2006/main" xmlns:pic="http://schemas.openxmlformats.org/drawingml/2006/picture">
             <wp:extent cx="5486400" cy="3084594"/>
-            <wp:docPr id="8" name="Picture 8"/>
+            <wp:docPr id="7" name="Picture 7"/>
             <wp:cNvGraphicFramePr>
               <a:graphicFrameLocks noChangeAspect="1"/>
             </wp:cNvGraphicFramePr>
@@ -5038,233 +4925,7 @@
               <a:graphicData uri="http://schemas.openxmlformats.org/drawingml/2006/picture">
                 <pic:pic>
                   <pic:nvPicPr>
-                    <pic:cNvPr id="0" name="screen_01_login.png"/>
-                    <pic:cNvPicPr/>
-                  </pic:nvPicPr>
-                  <pic:blipFill>
-                    <a:blip r:embed="rId14"/>
-                    <a:stretch>
-                      <a:fillRect/>
-                    </a:stretch>
-                  </pic:blipFill>
-                  <pic:spPr>
-                    <a:xfrm>
-                      <a:off x="0" y="0"/>
-                      <a:ext cx="5486400" cy="3084594"/>
-                    </a:xfrm>
-                    <a:prstGeom prst="rect"/>
-                  </pic:spPr>
-                </pic:pic>
-              </a:graphicData>
-            </a:graphic>
-          </wp:inline>
-        </w:drawing>
-      </w:r>
-    </w:p>
-    <w:p>
-      <w:pPr>
-        <w:spacing w:after="140" w:line="340" w:lineRule="exact"/>
-      </w:pPr>
-      <w:r>
-        <w:rPr>
-          <w:rFonts w:ascii="Segoe UI Symbol" w:hAnsi="Segoe UI Symbol"/>
-          <w:sz w:val="23"/>
-        </w:rPr>
-        <w:t xml:space="preserve">➢ </w:t>
-      </w:r>
-      <w:r>
-        <w:rPr>
-          <w:sz w:val="23"/>
-        </w:rPr>
-        <w:t>This is the profile page of the website.</w:t>
-      </w:r>
-    </w:p>
-    <w:p>
-      <w:pPr>
-        <w:spacing w:after="140" w:line="340" w:lineRule="exact"/>
-      </w:pPr>
-      <w:r>
-        <w:rPr>
-          <w:rFonts w:ascii="Segoe UI Symbol" w:hAnsi="Segoe UI Symbol"/>
-          <w:sz w:val="23"/>
-        </w:rPr>
-        <w:t xml:space="preserve">➢ </w:t>
-      </w:r>
-      <w:r>
-        <w:rPr>
-          <w:sz w:val="23"/>
-        </w:rPr>
-        <w:t>Users can view and update personal details like name, email, phone, and avatar image.</w:t>
-      </w:r>
-    </w:p>
-    <w:p>
-      <w:pPr>
-        <w:spacing w:after="140" w:line="340" w:lineRule="exact"/>
-      </w:pPr>
-      <w:r>
-        <w:rPr>
-          <w:rFonts w:ascii="Segoe UI Symbol" w:hAnsi="Segoe UI Symbol"/>
-          <w:sz w:val="23"/>
-        </w:rPr>
-        <w:t xml:space="preserve">➢ </w:t>
-      </w:r>
-      <w:r>
-        <w:rPr>
-          <w:sz w:val="23"/>
-        </w:rPr>
-        <w:t>Users can also change their password and save profile changes easily.</w:t>
-      </w:r>
-    </w:p>
-    <w:p>
-      <w:r>
-        <w:br w:type="page"/>
-      </w:r>
-    </w:p>
-    <w:p>
-      <w:pPr>
-        <w:spacing w:before="80" w:after="160"/>
-        <w:jc w:val="left"/>
-      </w:pPr>
-      <w:r>
-        <w:rPr>
-          <w:b/>
-          <w:sz w:val="28"/>
-          <w:u w:val="single"/>
-        </w:rPr>
-        <w:t>Dashboard Page:</w:t>
-      </w:r>
-    </w:p>
-    <w:p>
-      <w:pPr>
-        <w:spacing w:after="240"/>
-        <w:jc w:val="center"/>
-      </w:pPr>
-      <w:r>
-        <w:drawing>
-          <wp:inline xmlns:a="http://schemas.openxmlformats.org/drawingml/2006/main" xmlns:pic="http://schemas.openxmlformats.org/drawingml/2006/picture">
-            <wp:extent cx="5486400" cy="3084594"/>
-            <wp:docPr id="9" name="Picture 9"/>
-            <wp:cNvGraphicFramePr>
-              <a:graphicFrameLocks noChangeAspect="1"/>
-            </wp:cNvGraphicFramePr>
-            <a:graphic>
-              <a:graphicData uri="http://schemas.openxmlformats.org/drawingml/2006/picture">
-                <pic:pic>
-                  <pic:nvPicPr>
-                    <pic:cNvPr id="0" name="screen_01_login.png"/>
-                    <pic:cNvPicPr/>
-                  </pic:nvPicPr>
-                  <pic:blipFill>
-                    <a:blip r:embed="rId14"/>
-                    <a:stretch>
-                      <a:fillRect/>
-                    </a:stretch>
-                  </pic:blipFill>
-                  <pic:spPr>
-                    <a:xfrm>
-                      <a:off x="0" y="0"/>
-                      <a:ext cx="5486400" cy="3084594"/>
-                    </a:xfrm>
-                    <a:prstGeom prst="rect"/>
-                  </pic:spPr>
-                </pic:pic>
-              </a:graphicData>
-            </a:graphic>
-          </wp:inline>
-        </w:drawing>
-      </w:r>
-    </w:p>
-    <w:p>
-      <w:pPr>
-        <w:spacing w:after="140" w:line="340" w:lineRule="exact"/>
-      </w:pPr>
-      <w:r>
-        <w:rPr>
-          <w:rFonts w:ascii="Segoe UI Symbol" w:hAnsi="Segoe UI Symbol"/>
-          <w:sz w:val="23"/>
-        </w:rPr>
-        <w:t xml:space="preserve">➢ </w:t>
-      </w:r>
-      <w:r>
-        <w:rPr>
-          <w:sz w:val="23"/>
-        </w:rPr>
-        <w:t>This is the dashboard page of the website.</w:t>
-      </w:r>
-    </w:p>
-    <w:p>
-      <w:pPr>
-        <w:spacing w:after="140" w:line="340" w:lineRule="exact"/>
-      </w:pPr>
-      <w:r>
-        <w:rPr>
-          <w:rFonts w:ascii="Segoe UI Symbol" w:hAnsi="Segoe UI Symbol"/>
-          <w:sz w:val="23"/>
-        </w:rPr>
-        <w:t xml:space="preserve">➢ </w:t>
-      </w:r>
-      <w:r>
-        <w:rPr>
-          <w:sz w:val="23"/>
-        </w:rPr>
-        <w:t>Users can view sales revenue trends, inventory alerts, and key business indices.</w:t>
-      </w:r>
-    </w:p>
-    <w:p>
-      <w:pPr>
-        <w:spacing w:after="140" w:line="340" w:lineRule="exact"/>
-      </w:pPr>
-      <w:r>
-        <w:rPr>
-          <w:rFonts w:ascii="Segoe UI Symbol" w:hAnsi="Segoe UI Symbol"/>
-          <w:sz w:val="23"/>
-        </w:rPr>
-        <w:t xml:space="preserve">➢ </w:t>
-      </w:r>
-      <w:r>
-        <w:rPr>
-          <w:sz w:val="23"/>
-        </w:rPr>
-        <w:t>It helps store managers understand operations and make better business decisions.</w:t>
-      </w:r>
-    </w:p>
-    <w:p>
-      <w:r>
-        <w:br w:type="page"/>
-      </w:r>
-    </w:p>
-    <w:p>
-      <w:pPr>
-        <w:spacing w:before="80" w:after="160"/>
-        <w:jc w:val="left"/>
-      </w:pPr>
-      <w:r>
-        <w:rPr>
-          <w:b/>
-          <w:sz w:val="28"/>
-          <w:u w:val="single"/>
-        </w:rPr>
-        <w:t>Recent Activity Page:</w:t>
-      </w:r>
-    </w:p>
-    <w:p>
-      <w:pPr>
-        <w:spacing w:after="240"/>
-        <w:jc w:val="center"/>
-      </w:pPr>
-      <w:r>
-        <w:drawing>
-          <wp:inline xmlns:a="http://schemas.openxmlformats.org/drawingml/2006/main" xmlns:pic="http://schemas.openxmlformats.org/drawingml/2006/picture">
-            <wp:extent cx="5486400" cy="3084594"/>
-            <wp:docPr id="10" name="Picture 10"/>
-            <wp:cNvGraphicFramePr>
-              <a:graphicFrameLocks noChangeAspect="1"/>
-            </wp:cNvGraphicFramePr>
-            <a:graphic>
-              <a:graphicData uri="http://schemas.openxmlformats.org/drawingml/2006/picture">
-                <pic:pic>
-                  <pic:nvPicPr>
-                    <pic:cNvPr id="0" name="screen_04_recent_activity.png"/>
+                    <pic:cNvPr id="0" name="screen_06_admin_pwd.png"/>
                     <pic:cNvPicPr/>
                   </pic:nvPicPr>
                   <pic:blipFill>
@@ -5302,7 +4963,7 @@
         <w:rPr>
           <w:sz w:val="23"/>
         </w:rPr>
-        <w:t>This section shows the real-time activity and audit feed of the platform.</w:t>
+        <w:t>This is the admin password override page of the website.</w:t>
       </w:r>
     </w:p>
     <w:p>
@@ -5320,7 +4981,7 @@
         <w:rPr>
           <w:sz w:val="23"/>
         </w:rPr>
-        <w:t>Users can view stock additions, recent sales, and cashier logins with timestamps.</w:t>
+        <w:t>Super Admin can securely reset passwords for cashiers, managers, and employees.</w:t>
       </w:r>
     </w:p>
     <w:p>
@@ -5338,7 +4999,7 @@
         <w:rPr>
           <w:sz w:val="23"/>
         </w:rPr>
-        <w:t>It helps supervisors monitor transactions and audit store movements easily.</w:t>
+        <w:t>Ensures strict identity verification and business data protection.</w:t>
       </w:r>
     </w:p>
     <w:p>
@@ -5357,7 +5018,7 @@
           <w:sz w:val="28"/>
           <w:u w:val="single"/>
         </w:rPr>
-        <w:t>POS Terminal Page:</w:t>
+        <w:t>Profile Page:</w:t>
       </w:r>
     </w:p>
     <w:p>
@@ -5369,7 +5030,7 @@
         <w:drawing>
           <wp:inline xmlns:a="http://schemas.openxmlformats.org/drawingml/2006/main" xmlns:pic="http://schemas.openxmlformats.org/drawingml/2006/picture">
             <wp:extent cx="5486400" cy="3084594"/>
-            <wp:docPr id="11" name="Picture 11"/>
+            <wp:docPr id="8" name="Picture 8"/>
             <wp:cNvGraphicFramePr>
               <a:graphicFrameLocks noChangeAspect="1"/>
             </wp:cNvGraphicFramePr>
@@ -5377,11 +5038,11 @@
               <a:graphicData uri="http://schemas.openxmlformats.org/drawingml/2006/picture">
                 <pic:pic>
                   <pic:nvPicPr>
-                    <pic:cNvPr id="0" name="screen_01_login.png"/>
+                    <pic:cNvPr id="0" name="screen_07_profile.png"/>
                     <pic:cNvPicPr/>
                   </pic:nvPicPr>
                   <pic:blipFill>
-                    <a:blip r:embed="rId14"/>
+                    <a:blip r:embed="rId18"/>
                     <a:stretch>
                       <a:fillRect/>
                     </a:stretch>
@@ -5415,7 +5076,7 @@
         <w:rPr>
           <w:sz w:val="23"/>
         </w:rPr>
-        <w:t>This is the Point of Sale terminal page of the website.</w:t>
+        <w:t>This is the profile page of the website.</w:t>
       </w:r>
     </w:p>
     <w:p>
@@ -5433,7 +5094,7 @@
         <w:rPr>
           <w:sz w:val="23"/>
         </w:rPr>
-        <w:t>Users can view all hardware products, category tabs, and real-time inventory counts.</w:t>
+        <w:t>Users can view and update personal details like name, email, phone, and avatar image.</w:t>
       </w:r>
     </w:p>
     <w:p>
@@ -5451,7 +5112,7 @@
         <w:rPr>
           <w:sz w:val="23"/>
         </w:rPr>
-        <w:t>Cashiers can select items, adjust quantities, and calculate 18% GST in real time.</w:t>
+        <w:t>Users can also change their password and save profile changes easily.</w:t>
       </w:r>
     </w:p>
     <w:p>
@@ -5470,7 +5131,7 @@
           <w:sz w:val="28"/>
           <w:u w:val="single"/>
         </w:rPr>
-        <w:t>POS Search Feature:</w:t>
+        <w:t>Dashboard Page:</w:t>
       </w:r>
     </w:p>
     <w:p>
@@ -5481,8 +5142,8 @@
       <w:r>
         <w:drawing>
           <wp:inline xmlns:a="http://schemas.openxmlformats.org/drawingml/2006/main" xmlns:pic="http://schemas.openxmlformats.org/drawingml/2006/picture">
-            <wp:extent cx="5486400" cy="2606040"/>
-            <wp:docPr id="12" name="Picture 12"/>
+            <wp:extent cx="5486400" cy="3084594"/>
+            <wp:docPr id="9" name="Picture 9"/>
             <wp:cNvGraphicFramePr>
               <a:graphicFrameLocks noChangeAspect="1"/>
             </wp:cNvGraphicFramePr>
@@ -5490,350 +5151,11 @@
               <a:graphicData uri="http://schemas.openxmlformats.org/drawingml/2006/picture">
                 <pic:pic>
                   <pic:nvPicPr>
-                    <pic:cNvPr id="0" name="screenshot_pos_search.png"/>
-                    <pic:cNvPicPr/>
-                  </pic:nvPicPr>
-                  <pic:blipFill>
-                    <a:blip r:embed="rId18"/>
-                    <a:stretch>
-                      <a:fillRect/>
-                    </a:stretch>
-                  </pic:blipFill>
-                  <pic:spPr>
-                    <a:xfrm>
-                      <a:off x="0" y="0"/>
-                      <a:ext cx="5486400" cy="2606040"/>
-                    </a:xfrm>
-                    <a:prstGeom prst="rect"/>
-                  </pic:spPr>
-                </pic:pic>
-              </a:graphicData>
-            </a:graphic>
-          </wp:inline>
-        </w:drawing>
-      </w:r>
-    </w:p>
-    <w:p>
-      <w:pPr>
-        <w:spacing w:after="140" w:line="340" w:lineRule="exact"/>
-      </w:pPr>
-      <w:r>
-        <w:rPr>
-          <w:rFonts w:ascii="Segoe UI Symbol" w:hAnsi="Segoe UI Symbol"/>
-          <w:sz w:val="23"/>
-        </w:rPr>
-        <w:t xml:space="preserve">➢ </w:t>
-      </w:r>
-      <w:r>
-        <w:rPr>
-          <w:sz w:val="23"/>
-        </w:rPr>
-        <w:t>This is the instant product search and barcode scanner listener of the POS terminal.</w:t>
-      </w:r>
-    </w:p>
-    <w:p>
-      <w:pPr>
-        <w:spacing w:after="140" w:line="340" w:lineRule="exact"/>
-      </w:pPr>
-      <w:r>
-        <w:rPr>
-          <w:rFonts w:ascii="Segoe UI Symbol" w:hAnsi="Segoe UI Symbol"/>
-          <w:sz w:val="23"/>
-        </w:rPr>
-        <w:t xml:space="preserve">➢ </w:t>
-      </w:r>
-      <w:r>
-        <w:rPr>
-          <w:sz w:val="23"/>
-        </w:rPr>
-        <w:t>Users can search and filter hardware items by brand or keyword in sub-milliseconds.</w:t>
-      </w:r>
-    </w:p>
-    <w:p>
-      <w:pPr>
-        <w:spacing w:after="140" w:line="340" w:lineRule="exact"/>
-      </w:pPr>
-      <w:r>
-        <w:rPr>
-          <w:rFonts w:ascii="Segoe UI Symbol" w:hAnsi="Segoe UI Symbol"/>
-          <w:sz w:val="23"/>
-        </w:rPr>
-        <w:t xml:space="preserve">➢ </w:t>
-      </w:r>
-      <w:r>
-        <w:rPr>
-          <w:sz w:val="23"/>
-        </w:rPr>
-        <w:t>It displays item image, price, stock status, and + Add button for rapid checkout.</w:t>
-      </w:r>
-    </w:p>
-    <w:p>
-      <w:r>
-        <w:br w:type="page"/>
-      </w:r>
-    </w:p>
-    <w:p>
-      <w:pPr>
-        <w:spacing w:before="80" w:after="160"/>
-        <w:jc w:val="left"/>
-      </w:pPr>
-      <w:r>
-        <w:rPr>
-          <w:b/>
-          <w:sz w:val="28"/>
-          <w:u w:val="single"/>
-        </w:rPr>
-        <w:t>POS Cart &amp; Payment Modes:</w:t>
-      </w:r>
-    </w:p>
-    <w:p>
-      <w:pPr>
-        <w:spacing w:after="240"/>
-        <w:jc w:val="center"/>
-      </w:pPr>
-      <w:r>
-        <w:drawing>
-          <wp:inline xmlns:a="http://schemas.openxmlformats.org/drawingml/2006/main" xmlns:pic="http://schemas.openxmlformats.org/drawingml/2006/picture">
-            <wp:extent cx="5486400" cy="2606040"/>
-            <wp:docPr id="13" name="Picture 13"/>
-            <wp:cNvGraphicFramePr>
-              <a:graphicFrameLocks noChangeAspect="1"/>
-            </wp:cNvGraphicFramePr>
-            <a:graphic>
-              <a:graphicData uri="http://schemas.openxmlformats.org/drawingml/2006/picture">
-                <pic:pic>
-                  <pic:nvPicPr>
-                    <pic:cNvPr id="0" name="screenshot_pos_terminal.png"/>
+                    <pic:cNvPr id="0" name="screen_03_dashboard_light.png"/>
                     <pic:cNvPicPr/>
                   </pic:nvPicPr>
                   <pic:blipFill>
                     <a:blip r:embed="rId19"/>
-                    <a:stretch>
-                      <a:fillRect/>
-                    </a:stretch>
-                  </pic:blipFill>
-                  <pic:spPr>
-                    <a:xfrm>
-                      <a:off x="0" y="0"/>
-                      <a:ext cx="5486400" cy="2606040"/>
-                    </a:xfrm>
-                    <a:prstGeom prst="rect"/>
-                  </pic:spPr>
-                </pic:pic>
-              </a:graphicData>
-            </a:graphic>
-          </wp:inline>
-        </w:drawing>
-      </w:r>
-    </w:p>
-    <w:p>
-      <w:pPr>
-        <w:spacing w:after="140" w:line="340" w:lineRule="exact"/>
-      </w:pPr>
-      <w:r>
-        <w:rPr>
-          <w:rFonts w:ascii="Segoe UI Symbol" w:hAnsi="Segoe UI Symbol"/>
-          <w:sz w:val="23"/>
-        </w:rPr>
-        <w:t xml:space="preserve">➢ </w:t>
-      </w:r>
-      <w:r>
-        <w:rPr>
-          <w:sz w:val="23"/>
-        </w:rPr>
-        <w:t>This section displays the interactive cart and multi-mode payment options.</w:t>
-      </w:r>
-    </w:p>
-    <w:p>
-      <w:pPr>
-        <w:spacing w:after="140" w:line="340" w:lineRule="exact"/>
-      </w:pPr>
-      <w:r>
-        <w:rPr>
-          <w:rFonts w:ascii="Segoe UI Symbol" w:hAnsi="Segoe UI Symbol"/>
-          <w:sz w:val="23"/>
-        </w:rPr>
-        <w:t xml:space="preserve">➢ </w:t>
-      </w:r>
-      <w:r>
-        <w:rPr>
-          <w:sz w:val="23"/>
-        </w:rPr>
-        <w:t>Cashiers can adjust quantities, apply item discounts, and select Cash, Card, or UPI.</w:t>
-      </w:r>
-    </w:p>
-    <w:p>
-      <w:pPr>
-        <w:spacing w:after="140" w:line="340" w:lineRule="exact"/>
-      </w:pPr>
-      <w:r>
-        <w:rPr>
-          <w:rFonts w:ascii="Segoe UI Symbol" w:hAnsi="Segoe UI Symbol"/>
-          <w:sz w:val="23"/>
-        </w:rPr>
-        <w:t xml:space="preserve">➢ </w:t>
-      </w:r>
-      <w:r>
-        <w:rPr>
-          <w:sz w:val="23"/>
-        </w:rPr>
-        <w:t>Supports instant calculation of tendered amount and customer change balance.</w:t>
-      </w:r>
-    </w:p>
-    <w:p>
-      <w:r>
-        <w:br w:type="page"/>
-      </w:r>
-    </w:p>
-    <w:p>
-      <w:pPr>
-        <w:spacing w:before="80" w:after="160"/>
-        <w:jc w:val="left"/>
-      </w:pPr>
-      <w:r>
-        <w:rPr>
-          <w:b/>
-          <w:sz w:val="28"/>
-          <w:u w:val="single"/>
-        </w:rPr>
-        <w:t>Sales Invoices Page:</w:t>
-      </w:r>
-    </w:p>
-    <w:p>
-      <w:pPr>
-        <w:spacing w:after="240"/>
-        <w:jc w:val="center"/>
-      </w:pPr>
-      <w:r>
-        <w:drawing>
-          <wp:inline xmlns:a="http://schemas.openxmlformats.org/drawingml/2006/main" xmlns:pic="http://schemas.openxmlformats.org/drawingml/2006/picture">
-            <wp:extent cx="5486400" cy="2606040"/>
-            <wp:docPr id="14" name="Picture 14"/>
-            <wp:cNvGraphicFramePr>
-              <a:graphicFrameLocks noChangeAspect="1"/>
-            </wp:cNvGraphicFramePr>
-            <a:graphic>
-              <a:graphicData uri="http://schemas.openxmlformats.org/drawingml/2006/picture">
-                <pic:pic>
-                  <pic:nvPicPr>
-                    <pic:cNvPr id="0" name="screenshot_sales_invoices.png"/>
-                    <pic:cNvPicPr/>
-                  </pic:nvPicPr>
-                  <pic:blipFill>
-                    <a:blip r:embed="rId20"/>
-                    <a:stretch>
-                      <a:fillRect/>
-                    </a:stretch>
-                  </pic:blipFill>
-                  <pic:spPr>
-                    <a:xfrm>
-                      <a:off x="0" y="0"/>
-                      <a:ext cx="5486400" cy="2606040"/>
-                    </a:xfrm>
-                    <a:prstGeom prst="rect"/>
-                  </pic:spPr>
-                </pic:pic>
-              </a:graphicData>
-            </a:graphic>
-          </wp:inline>
-        </w:drawing>
-      </w:r>
-    </w:p>
-    <w:p>
-      <w:pPr>
-        <w:spacing w:after="140" w:line="340" w:lineRule="exact"/>
-      </w:pPr>
-      <w:r>
-        <w:rPr>
-          <w:rFonts w:ascii="Segoe UI Symbol" w:hAnsi="Segoe UI Symbol"/>
-          <w:sz w:val="23"/>
-        </w:rPr>
-        <w:t xml:space="preserve">➢ </w:t>
-      </w:r>
-      <w:r>
-        <w:rPr>
-          <w:sz w:val="23"/>
-        </w:rPr>
-        <w:t>This is the sales invoices master ledger page of the website.</w:t>
-      </w:r>
-    </w:p>
-    <w:p>
-      <w:pPr>
-        <w:spacing w:after="140" w:line="340" w:lineRule="exact"/>
-      </w:pPr>
-      <w:r>
-        <w:rPr>
-          <w:rFonts w:ascii="Segoe UI Symbol" w:hAnsi="Segoe UI Symbol"/>
-          <w:sz w:val="23"/>
-        </w:rPr>
-        <w:t xml:space="preserve">➢ </w:t>
-      </w:r>
-      <w:r>
-        <w:rPr>
-          <w:sz w:val="23"/>
-        </w:rPr>
-        <w:t>Invoices are assigned clean sequential numbering (INV-26-01, INV-26-02...).</w:t>
-      </w:r>
-    </w:p>
-    <w:p>
-      <w:pPr>
-        <w:spacing w:after="140" w:line="340" w:lineRule="exact"/>
-      </w:pPr>
-      <w:r>
-        <w:rPr>
-          <w:rFonts w:ascii="Segoe UI Symbol" w:hAnsi="Segoe UI Symbol"/>
-          <w:sz w:val="23"/>
-        </w:rPr>
-        <w:t xml:space="preserve">➢ </w:t>
-      </w:r>
-      <w:r>
-        <w:rPr>
-          <w:sz w:val="23"/>
-        </w:rPr>
-        <w:t>Managers can inspect line items, payment status, and print A4 or thermal receipts.</w:t>
-      </w:r>
-    </w:p>
-    <w:p>
-      <w:r>
-        <w:br w:type="page"/>
-      </w:r>
-    </w:p>
-    <w:p>
-      <w:pPr>
-        <w:spacing w:before="80" w:after="160"/>
-        <w:jc w:val="left"/>
-      </w:pPr>
-      <w:r>
-        <w:rPr>
-          <w:b/>
-          <w:sz w:val="28"/>
-          <w:u w:val="single"/>
-        </w:rPr>
-        <w:t>Products Catalog Page:</w:t>
-      </w:r>
-    </w:p>
-    <w:p>
-      <w:pPr>
-        <w:spacing w:after="240"/>
-        <w:jc w:val="center"/>
-      </w:pPr>
-      <w:r>
-        <w:drawing>
-          <wp:inline xmlns:a="http://schemas.openxmlformats.org/drawingml/2006/main" xmlns:pic="http://schemas.openxmlformats.org/drawingml/2006/picture">
-            <wp:extent cx="5486400" cy="3084594"/>
-            <wp:docPr id="15" name="Picture 15"/>
-            <wp:cNvGraphicFramePr>
-              <a:graphicFrameLocks noChangeAspect="1"/>
-            </wp:cNvGraphicFramePr>
-            <a:graphic>
-              <a:graphicData uri="http://schemas.openxmlformats.org/drawingml/2006/picture">
-                <pic:pic>
-                  <pic:nvPicPr>
-                    <pic:cNvPr id="0" name="screen_01_login.png"/>
-                    <pic:cNvPicPr/>
-                  </pic:nvPicPr>
-                  <pic:blipFill>
-                    <a:blip r:embed="rId14"/>
                     <a:stretch>
                       <a:fillRect/>
                     </a:stretch>
@@ -5867,7 +5189,7 @@
         <w:rPr>
           <w:sz w:val="23"/>
         </w:rPr>
-        <w:t>This is the master product catalog management page of the website.</w:t>
+        <w:t>This is the dashboard page of the website.</w:t>
       </w:r>
     </w:p>
     <w:p>
@@ -5885,7 +5207,7 @@
         <w:rPr>
           <w:sz w:val="23"/>
         </w:rPr>
-        <w:t>Users can view all products added to inventory along with cost and selling price.</w:t>
+        <w:t>Users can view sales revenue trends, inventory alerts, and key business indices.</w:t>
       </w:r>
     </w:p>
     <w:p>
@@ -5903,7 +5225,7 @@
         <w:rPr>
           <w:sz w:val="23"/>
         </w:rPr>
-        <w:t>Users can also edit items, generate barcodes, and monitor low-stock thresholds.</w:t>
+        <w:t>It helps store managers understand operations and make better business decisions.</w:t>
       </w:r>
     </w:p>
     <w:p>
@@ -5922,7 +5244,7 @@
           <w:sz w:val="28"/>
           <w:u w:val="single"/>
         </w:rPr>
-        <w:t>Add Product Page:</w:t>
+        <w:t>Recent Activity Page:</w:t>
       </w:r>
     </w:p>
     <w:p>
@@ -5934,7 +5256,7 @@
         <w:drawing>
           <wp:inline xmlns:a="http://schemas.openxmlformats.org/drawingml/2006/main" xmlns:pic="http://schemas.openxmlformats.org/drawingml/2006/picture">
             <wp:extent cx="5486400" cy="3084594"/>
-            <wp:docPr id="16" name="Picture 16"/>
+            <wp:docPr id="10" name="Picture 10"/>
             <wp:cNvGraphicFramePr>
               <a:graphicFrameLocks noChangeAspect="1"/>
             </wp:cNvGraphicFramePr>
@@ -5942,7 +5264,120 @@
               <a:graphicData uri="http://schemas.openxmlformats.org/drawingml/2006/picture">
                 <pic:pic>
                   <pic:nvPicPr>
-                    <pic:cNvPr id="0" name="screen_10_product_form.png"/>
+                    <pic:cNvPr id="0" name="screen_04_recent_activity.png"/>
+                    <pic:cNvPicPr/>
+                  </pic:nvPicPr>
+                  <pic:blipFill>
+                    <a:blip r:embed="rId20"/>
+                    <a:stretch>
+                      <a:fillRect/>
+                    </a:stretch>
+                  </pic:blipFill>
+                  <pic:spPr>
+                    <a:xfrm>
+                      <a:off x="0" y="0"/>
+                      <a:ext cx="5486400" cy="3084594"/>
+                    </a:xfrm>
+                    <a:prstGeom prst="rect"/>
+                  </pic:spPr>
+                </pic:pic>
+              </a:graphicData>
+            </a:graphic>
+          </wp:inline>
+        </w:drawing>
+      </w:r>
+    </w:p>
+    <w:p>
+      <w:pPr>
+        <w:spacing w:after="140" w:line="340" w:lineRule="exact"/>
+      </w:pPr>
+      <w:r>
+        <w:rPr>
+          <w:rFonts w:ascii="Segoe UI Symbol" w:hAnsi="Segoe UI Symbol"/>
+          <w:sz w:val="23"/>
+        </w:rPr>
+        <w:t xml:space="preserve">➢ </w:t>
+      </w:r>
+      <w:r>
+        <w:rPr>
+          <w:sz w:val="23"/>
+        </w:rPr>
+        <w:t>This section shows the real-time activity and audit feed of the platform.</w:t>
+      </w:r>
+    </w:p>
+    <w:p>
+      <w:pPr>
+        <w:spacing w:after="140" w:line="340" w:lineRule="exact"/>
+      </w:pPr>
+      <w:r>
+        <w:rPr>
+          <w:rFonts w:ascii="Segoe UI Symbol" w:hAnsi="Segoe UI Symbol"/>
+          <w:sz w:val="23"/>
+        </w:rPr>
+        <w:t xml:space="preserve">➢ </w:t>
+      </w:r>
+      <w:r>
+        <w:rPr>
+          <w:sz w:val="23"/>
+        </w:rPr>
+        <w:t>Users can view stock additions, recent sales, and cashier logins with timestamps.</w:t>
+      </w:r>
+    </w:p>
+    <w:p>
+      <w:pPr>
+        <w:spacing w:after="140" w:line="340" w:lineRule="exact"/>
+      </w:pPr>
+      <w:r>
+        <w:rPr>
+          <w:rFonts w:ascii="Segoe UI Symbol" w:hAnsi="Segoe UI Symbol"/>
+          <w:sz w:val="23"/>
+        </w:rPr>
+        <w:t xml:space="preserve">➢ </w:t>
+      </w:r>
+      <w:r>
+        <w:rPr>
+          <w:sz w:val="23"/>
+        </w:rPr>
+        <w:t>It helps supervisors monitor transactions and audit store movements easily.</w:t>
+      </w:r>
+    </w:p>
+    <w:p>
+      <w:r>
+        <w:br w:type="page"/>
+      </w:r>
+    </w:p>
+    <w:p>
+      <w:pPr>
+        <w:spacing w:before="80" w:after="160"/>
+        <w:jc w:val="left"/>
+      </w:pPr>
+      <w:r>
+        <w:rPr>
+          <w:b/>
+          <w:sz w:val="28"/>
+          <w:u w:val="single"/>
+        </w:rPr>
+        <w:t>POS Terminal Page:</w:t>
+      </w:r>
+    </w:p>
+    <w:p>
+      <w:pPr>
+        <w:spacing w:after="240"/>
+        <w:jc w:val="center"/>
+      </w:pPr>
+      <w:r>
+        <w:drawing>
+          <wp:inline xmlns:a="http://schemas.openxmlformats.org/drawingml/2006/main" xmlns:pic="http://schemas.openxmlformats.org/drawingml/2006/picture">
+            <wp:extent cx="5486400" cy="3084594"/>
+            <wp:docPr id="11" name="Picture 11"/>
+            <wp:cNvGraphicFramePr>
+              <a:graphicFrameLocks noChangeAspect="1"/>
+            </wp:cNvGraphicFramePr>
+            <a:graphic>
+              <a:graphicData uri="http://schemas.openxmlformats.org/drawingml/2006/picture">
+                <pic:pic>
+                  <pic:nvPicPr>
+                    <pic:cNvPr id="0" name="screen_08_pos_terminal.png"/>
                     <pic:cNvPicPr/>
                   </pic:nvPicPr>
                   <pic:blipFill>
@@ -5980,7 +5415,7 @@
         <w:rPr>
           <w:sz w:val="23"/>
         </w:rPr>
-        <w:t>This is the product creation and catalog update page of the website.</w:t>
+        <w:t>This is the Point of Sale terminal page of the website.</w:t>
       </w:r>
     </w:p>
     <w:p>
@@ -5998,7 +5433,7 @@
         <w:rPr>
           <w:sz w:val="23"/>
         </w:rPr>
-        <w:t>Enforces strict duplicate product name prevention through case-insensitive checks.</w:t>
+        <w:t>Users can view all hardware products, category tabs, and real-time inventory counts.</w:t>
       </w:r>
     </w:p>
     <w:p>
@@ -6016,7 +5451,7 @@
         <w:rPr>
           <w:sz w:val="23"/>
         </w:rPr>
-        <w:t>Automatically generates unique SKU codes (FIM-XXXXXX) and EAN-13 barcodes.</w:t>
+        <w:t>Cashiers can select items, adjust quantities, and calculate 18% GST in real time.</w:t>
       </w:r>
     </w:p>
     <w:p>
@@ -6035,7 +5470,7 @@
           <w:sz w:val="28"/>
           <w:u w:val="single"/>
         </w:rPr>
-        <w:t>Product Categories Page:</w:t>
+        <w:t>POS Search Feature:</w:t>
       </w:r>
     </w:p>
     <w:p>
@@ -6046,8 +5481,8 @@
       <w:r>
         <w:drawing>
           <wp:inline xmlns:a="http://schemas.openxmlformats.org/drawingml/2006/main" xmlns:pic="http://schemas.openxmlformats.org/drawingml/2006/picture">
-            <wp:extent cx="5486400" cy="3084594"/>
-            <wp:docPr id="17" name="Picture 17"/>
+            <wp:extent cx="5486400" cy="2606040"/>
+            <wp:docPr id="12" name="Picture 12"/>
             <wp:cNvGraphicFramePr>
               <a:graphicFrameLocks noChangeAspect="1"/>
             </wp:cNvGraphicFramePr>
@@ -6055,11 +5490,124 @@
               <a:graphicData uri="http://schemas.openxmlformats.org/drawingml/2006/picture">
                 <pic:pic>
                   <pic:nvPicPr>
-                    <pic:cNvPr id="0" name="screen_01_login.png"/>
+                    <pic:cNvPr id="0" name="screenshot_pos_search.png"/>
                     <pic:cNvPicPr/>
                   </pic:nvPicPr>
                   <pic:blipFill>
-                    <a:blip r:embed="rId14"/>
+                    <a:blip r:embed="rId22"/>
+                    <a:stretch>
+                      <a:fillRect/>
+                    </a:stretch>
+                  </pic:blipFill>
+                  <pic:spPr>
+                    <a:xfrm>
+                      <a:off x="0" y="0"/>
+                      <a:ext cx="5486400" cy="2606040"/>
+                    </a:xfrm>
+                    <a:prstGeom prst="rect"/>
+                  </pic:spPr>
+                </pic:pic>
+              </a:graphicData>
+            </a:graphic>
+          </wp:inline>
+        </w:drawing>
+      </w:r>
+    </w:p>
+    <w:p>
+      <w:pPr>
+        <w:spacing w:after="140" w:line="340" w:lineRule="exact"/>
+      </w:pPr>
+      <w:r>
+        <w:rPr>
+          <w:rFonts w:ascii="Segoe UI Symbol" w:hAnsi="Segoe UI Symbol"/>
+          <w:sz w:val="23"/>
+        </w:rPr>
+        <w:t xml:space="preserve">➢ </w:t>
+      </w:r>
+      <w:r>
+        <w:rPr>
+          <w:sz w:val="23"/>
+        </w:rPr>
+        <w:t>This is the instant product search and barcode scanner listener of the POS terminal.</w:t>
+      </w:r>
+    </w:p>
+    <w:p>
+      <w:pPr>
+        <w:spacing w:after="140" w:line="340" w:lineRule="exact"/>
+      </w:pPr>
+      <w:r>
+        <w:rPr>
+          <w:rFonts w:ascii="Segoe UI Symbol" w:hAnsi="Segoe UI Symbol"/>
+          <w:sz w:val="23"/>
+        </w:rPr>
+        <w:t xml:space="preserve">➢ </w:t>
+      </w:r>
+      <w:r>
+        <w:rPr>
+          <w:sz w:val="23"/>
+        </w:rPr>
+        <w:t>Users can search and filter hardware items by brand or keyword in sub-milliseconds.</w:t>
+      </w:r>
+    </w:p>
+    <w:p>
+      <w:pPr>
+        <w:spacing w:after="140" w:line="340" w:lineRule="exact"/>
+      </w:pPr>
+      <w:r>
+        <w:rPr>
+          <w:rFonts w:ascii="Segoe UI Symbol" w:hAnsi="Segoe UI Symbol"/>
+          <w:sz w:val="23"/>
+        </w:rPr>
+        <w:t xml:space="preserve">➢ </w:t>
+      </w:r>
+      <w:r>
+        <w:rPr>
+          <w:sz w:val="23"/>
+        </w:rPr>
+        <w:t>It displays item image, price, stock status, and + Add button for rapid checkout.</w:t>
+      </w:r>
+    </w:p>
+    <w:p>
+      <w:r>
+        <w:br w:type="page"/>
+      </w:r>
+    </w:p>
+    <w:p>
+      <w:pPr>
+        <w:spacing w:before="80" w:after="160"/>
+        <w:jc w:val="left"/>
+      </w:pPr>
+      <w:r>
+        <w:rPr>
+          <w:b/>
+          <w:sz w:val="28"/>
+          <w:u w:val="single"/>
+        </w:rPr>
+        <w:t>POS Cart &amp; Payment Modes:</w:t>
+      </w:r>
+    </w:p>
+    <w:p>
+      <w:pPr>
+        <w:spacing w:after="240"/>
+        <w:jc w:val="center"/>
+      </w:pPr>
+      <w:r>
+        <w:drawing>
+          <wp:inline xmlns:a="http://schemas.openxmlformats.org/drawingml/2006/main" xmlns:pic="http://schemas.openxmlformats.org/drawingml/2006/picture">
+            <wp:extent cx="5486400" cy="3084594"/>
+            <wp:docPr id="13" name="Picture 13"/>
+            <wp:cNvGraphicFramePr>
+              <a:graphicFrameLocks noChangeAspect="1"/>
+            </wp:cNvGraphicFramePr>
+            <a:graphic>
+              <a:graphicData uri="http://schemas.openxmlformats.org/drawingml/2006/picture">
+                <pic:pic>
+                  <pic:nvPicPr>
+                    <pic:cNvPr id="0" name="screen_08_pos_terminal.png"/>
+                    <pic:cNvPicPr/>
+                  </pic:nvPicPr>
+                  <pic:blipFill>
+                    <a:blip r:embed="rId21"/>
                     <a:stretch>
                       <a:fillRect/>
                     </a:stretch>
@@ -6093,7 +5641,7 @@
         <w:rPr>
           <w:sz w:val="23"/>
         </w:rPr>
-        <w:t>This is the product categories gallery page of the website.</w:t>
+        <w:t>This section displays the interactive cart and multi-mode payment options.</w:t>
       </w:r>
     </w:p>
     <w:p>
@@ -6111,7 +5659,7 @@
         <w:rPr>
           <w:sz w:val="23"/>
         </w:rPr>
-        <w:t>Organizes items into Laptops, Processors, GPUs, RAM, Monitors, and Cabinets.</w:t>
+        <w:t>Cashiers can adjust quantities, apply item discounts, and select Cash, Card, or UPI.</w:t>
       </w:r>
     </w:p>
     <w:p>
@@ -6129,7 +5677,7 @@
         <w:rPr>
           <w:sz w:val="23"/>
         </w:rPr>
-        <w:t>Each category includes thumbnail branding and active catalog product counters.</w:t>
+        <w:t>Supports instant calculation of tendered amount and customer change balance.</w:t>
       </w:r>
     </w:p>
     <w:p>
@@ -6148,7 +5696,7 @@
           <w:sz w:val="28"/>
           <w:u w:val="single"/>
         </w:rPr>
-        <w:t>Hardware Brands Page:</w:t>
+        <w:t>Sales Invoices Page:</w:t>
       </w:r>
     </w:p>
     <w:p>
@@ -6160,7 +5708,7 @@
         <w:drawing>
           <wp:inline xmlns:a="http://schemas.openxmlformats.org/drawingml/2006/main" xmlns:pic="http://schemas.openxmlformats.org/drawingml/2006/picture">
             <wp:extent cx="5486400" cy="3084594"/>
-            <wp:docPr id="18" name="Picture 18"/>
+            <wp:docPr id="14" name="Picture 14"/>
             <wp:cNvGraphicFramePr>
               <a:graphicFrameLocks noChangeAspect="1"/>
             </wp:cNvGraphicFramePr>
@@ -6168,11 +5716,11 @@
               <a:graphicData uri="http://schemas.openxmlformats.org/drawingml/2006/picture">
                 <pic:pic>
                   <pic:nvPicPr>
-                    <pic:cNvPr id="0" name="screen_01_login.png"/>
+                    <pic:cNvPr id="0" name="screenshot_sales_invoices.png"/>
                     <pic:cNvPicPr/>
                   </pic:nvPicPr>
                   <pic:blipFill>
-                    <a:blip r:embed="rId14"/>
+                    <a:blip r:embed="rId23"/>
                     <a:stretch>
                       <a:fillRect/>
                     </a:stretch>
@@ -6206,7 +5754,7 @@
         <w:rPr>
           <w:sz w:val="23"/>
         </w:rPr>
-        <w:t>This is the hardware manufacturer brands management page of the website.</w:t>
+        <w:t>This is the sales invoices master ledger page of the website.</w:t>
       </w:r>
     </w:p>
     <w:p>
@@ -6224,7 +5772,7 @@
         <w:rPr>
           <w:sz w:val="23"/>
         </w:rPr>
-        <w:t>Tracks industry brands like ASUS, MSI, HP, Dell, Intel, AMD, and NVIDIA.</w:t>
+        <w:t>Invoices are assigned clean sequential numbering (INV-26-01, INV-26-02...).</w:t>
       </w:r>
     </w:p>
     <w:p>
@@ -6242,7 +5790,7 @@
         <w:rPr>
           <w:sz w:val="23"/>
         </w:rPr>
-        <w:t>Links brand logos and official websites directly to product listings.</w:t>
+        <w:t>Managers can inspect line items, payment status, and print A4 or thermal receipts.</w:t>
       </w:r>
     </w:p>
     <w:p>
@@ -6261,7 +5809,7 @@
           <w:sz w:val="28"/>
           <w:u w:val="single"/>
         </w:rPr>
-        <w:t>Purchase Orders Page:</w:t>
+        <w:t>Products Catalog Page:</w:t>
       </w:r>
     </w:p>
     <w:p>
@@ -6273,7 +5821,7 @@
         <w:drawing>
           <wp:inline xmlns:a="http://schemas.openxmlformats.org/drawingml/2006/main" xmlns:pic="http://schemas.openxmlformats.org/drawingml/2006/picture">
             <wp:extent cx="5486400" cy="3084594"/>
-            <wp:docPr id="19" name="Picture 19"/>
+            <wp:docPr id="15" name="Picture 15"/>
             <wp:cNvGraphicFramePr>
               <a:graphicFrameLocks noChangeAspect="1"/>
             </wp:cNvGraphicFramePr>
@@ -6281,11 +5829,11 @@
               <a:graphicData uri="http://schemas.openxmlformats.org/drawingml/2006/picture">
                 <pic:pic>
                   <pic:nvPicPr>
-                    <pic:cNvPr id="0" name="screen_01_login.png"/>
+                    <pic:cNvPr id="0" name="screen_09_products_list.png"/>
                     <pic:cNvPicPr/>
                   </pic:nvPicPr>
                   <pic:blipFill>
-                    <a:blip r:embed="rId14"/>
+                    <a:blip r:embed="rId24"/>
                     <a:stretch>
                       <a:fillRect/>
                     </a:stretch>
@@ -6319,7 +5867,7 @@
         <w:rPr>
           <w:sz w:val="23"/>
         </w:rPr>
-        <w:t>This is the procurement and purchase orders master page of the website.</w:t>
+        <w:t>This is the master product catalog management page of the website.</w:t>
       </w:r>
     </w:p>
     <w:p>
@@ -6337,7 +5885,7 @@
         <w:rPr>
           <w:sz w:val="23"/>
         </w:rPr>
-        <w:t>Uses sequential PO numbering (PO-26-01...) with supplier bill number tracking.</w:t>
+        <w:t>Users can view all products added to inventory along with cost and selling price.</w:t>
       </w:r>
     </w:p>
     <w:p>
@@ -6355,7 +5903,7 @@
         <w:rPr>
           <w:sz w:val="23"/>
         </w:rPr>
-        <w:t>Displays total invoice value, disbursed payments, and current order status.</w:t>
+        <w:t>Users can also edit items, generate barcodes, and monitor low-stock thresholds.</w:t>
       </w:r>
     </w:p>
     <w:p>
@@ -6374,7 +5922,7 @@
           <w:sz w:val="28"/>
           <w:u w:val="single"/>
         </w:rPr>
-        <w:t>Add Purchase Order Page:</w:t>
+        <w:t>Add Product Page:</w:t>
       </w:r>
     </w:p>
     <w:p>
@@ -6386,7 +5934,7 @@
         <w:drawing>
           <wp:inline xmlns:a="http://schemas.openxmlformats.org/drawingml/2006/main" xmlns:pic="http://schemas.openxmlformats.org/drawingml/2006/picture">
             <wp:extent cx="5486400" cy="3084594"/>
-            <wp:docPr id="20" name="Picture 20"/>
+            <wp:docPr id="16" name="Picture 16"/>
             <wp:cNvGraphicFramePr>
               <a:graphicFrameLocks noChangeAspect="1"/>
             </wp:cNvGraphicFramePr>
@@ -6394,11 +5942,11 @@
               <a:graphicData uri="http://schemas.openxmlformats.org/drawingml/2006/picture">
                 <pic:pic>
                   <pic:nvPicPr>
-                    <pic:cNvPr id="0" name="screen_14_purchase_create.png"/>
+                    <pic:cNvPr id="0" name="screen_10_product_form.png"/>
                     <pic:cNvPicPr/>
                   </pic:nvPicPr>
                   <pic:blipFill>
-                    <a:blip r:embed="rId22"/>
+                    <a:blip r:embed="rId25"/>
                     <a:stretch>
                       <a:fillRect/>
                     </a:stretch>
@@ -6432,7 +5980,7 @@
         <w:rPr>
           <w:sz w:val="23"/>
         </w:rPr>
-        <w:t>This is the new stock procurement purchase order creation form.</w:t>
+        <w:t>This is the product creation and catalog update page of the website.</w:t>
       </w:r>
     </w:p>
     <w:p>
@@ -6450,7 +5998,7 @@
         <w:rPr>
           <w:sz w:val="23"/>
         </w:rPr>
-        <w:t>Creating a PO automatically credits inventory stock without extra receiving forms.</w:t>
+        <w:t>Enforces strict duplicate product name prevention through case-insensitive checks.</w:t>
       </w:r>
     </w:p>
     <w:p>
@@ -6468,7 +6016,7 @@
         <w:rPr>
           <w:sz w:val="23"/>
         </w:rPr>
-        <w:t>Tracks itemized cost prices, tax percentages, and expected delivery dates.</w:t>
+        <w:t>Automatically generates unique SKU codes (FIM-XXXXXX) and EAN-13 barcodes.</w:t>
       </w:r>
     </w:p>
     <w:p>
@@ -6487,7 +6035,7 @@
           <w:sz w:val="28"/>
           <w:u w:val="single"/>
         </w:rPr>
-        <w:t>Supplier Bill &amp; Payment Report:</w:t>
+        <w:t>Product Categories Page:</w:t>
       </w:r>
     </w:p>
     <w:p>
@@ -6499,7 +6047,7 @@
         <w:drawing>
           <wp:inline xmlns:a="http://schemas.openxmlformats.org/drawingml/2006/main" xmlns:pic="http://schemas.openxmlformats.org/drawingml/2006/picture">
             <wp:extent cx="5486400" cy="3084594"/>
-            <wp:docPr id="21" name="Picture 21"/>
+            <wp:docPr id="17" name="Picture 17"/>
             <wp:cNvGraphicFramePr>
               <a:graphicFrameLocks noChangeAspect="1"/>
             </wp:cNvGraphicFramePr>
@@ -6507,11 +6055,11 @@
               <a:graphicData uri="http://schemas.openxmlformats.org/drawingml/2006/picture">
                 <pic:pic>
                   <pic:nvPicPr>
-                    <pic:cNvPr id="0" name="screen_01_login.png"/>
+                    <pic:cNvPr id="0" name="screen_11_categories.png"/>
                     <pic:cNvPicPr/>
                   </pic:nvPicPr>
                   <pic:blipFill>
-                    <a:blip r:embed="rId14"/>
+                    <a:blip r:embed="rId26"/>
                     <a:stretch>
                       <a:fillRect/>
                     </a:stretch>
@@ -6545,7 +6093,7 @@
         <w:rPr>
           <w:sz w:val="23"/>
         </w:rPr>
-        <w:t>This is the advanced supplier ledger and bill reconciliation report.</w:t>
+        <w:t>This is the product categories gallery page of the website.</w:t>
       </w:r>
     </w:p>
     <w:p>
@@ -6563,7 +6111,7 @@
         <w:rPr>
           <w:sz w:val="23"/>
         </w:rPr>
-        <w:t>Provides complete visibility into total procurement, paid amounts, and balances.</w:t>
+        <w:t>Organizes items into Laptops, Processors, GPUs, RAM, Monitors, and Cabinets.</w:t>
       </w:r>
     </w:p>
     <w:p>
@@ -6581,7 +6129,7 @@
         <w:rPr>
           <w:sz w:val="23"/>
         </w:rPr>
-        <w:t>Offers multi-criteria filtering by supplier, status, date, and 1-click PDF export.</w:t>
+        <w:t>Each category includes thumbnail branding and active catalog product counters.</w:t>
       </w:r>
     </w:p>
     <w:p>
@@ -6600,7 +6148,7 @@
           <w:sz w:val="28"/>
           <w:u w:val="single"/>
         </w:rPr>
-        <w:t>Settings &amp; Branding Page:</w:t>
+        <w:t>Hardware Brands Page:</w:t>
       </w:r>
     </w:p>
     <w:p>
@@ -6612,7 +6160,7 @@
         <w:drawing>
           <wp:inline xmlns:a="http://schemas.openxmlformats.org/drawingml/2006/main" xmlns:pic="http://schemas.openxmlformats.org/drawingml/2006/picture">
             <wp:extent cx="5486400" cy="3084594"/>
-            <wp:docPr id="22" name="Picture 22"/>
+            <wp:docPr id="18" name="Picture 18"/>
             <wp:cNvGraphicFramePr>
               <a:graphicFrameLocks noChangeAspect="1"/>
             </wp:cNvGraphicFramePr>
@@ -6620,11 +6168,11 @@
               <a:graphicData uri="http://schemas.openxmlformats.org/drawingml/2006/picture">
                 <pic:pic>
                   <pic:nvPicPr>
-                    <pic:cNvPr id="0" name="screen_01_login.png"/>
+                    <pic:cNvPr id="0" name="screen_12_brands.png"/>
                     <pic:cNvPicPr/>
                   </pic:nvPicPr>
                   <pic:blipFill>
-                    <a:blip r:embed="rId14"/>
+                    <a:blip r:embed="rId27"/>
                     <a:stretch>
                       <a:fillRect/>
                     </a:stretch>
@@ -6658,7 +6206,7 @@
         <w:rPr>
           <w:sz w:val="23"/>
         </w:rPr>
-        <w:t>This is the enterprise company settings and branding page of the website.</w:t>
+        <w:t>This is the hardware manufacturer brands management page of the website.</w:t>
       </w:r>
     </w:p>
     <w:p>
@@ -6676,7 +6224,7 @@
         <w:rPr>
           <w:sz w:val="23"/>
         </w:rPr>
-        <w:t>Admin can upload custom company logos with live instant thumbnail preview.</w:t>
+        <w:t>Tracks industry brands like ASUS, MSI, HP, Dell, Intel, AMD, and NVIDIA.</w:t>
       </w:r>
     </w:p>
     <w:p>
@@ -6694,7 +6242,7 @@
         <w:rPr>
           <w:sz w:val="23"/>
         </w:rPr>
-        <w:t>Configures store contact information, GST number, currency, and theme colors.</w:t>
+        <w:t>Links brand logos and official websites directly to product listings.</w:t>
       </w:r>
     </w:p>
     <w:p>
@@ -6713,7 +6261,7 @@
           <w:sz w:val="28"/>
           <w:u w:val="single"/>
         </w:rPr>
-        <w:t>Employee Attendance Page:</w:t>
+        <w:t>Purchase Orders Page:</w:t>
       </w:r>
     </w:p>
     <w:p>
@@ -6725,7 +6273,7 @@
         <w:drawing>
           <wp:inline xmlns:a="http://schemas.openxmlformats.org/drawingml/2006/main" xmlns:pic="http://schemas.openxmlformats.org/drawingml/2006/picture">
             <wp:extent cx="5486400" cy="3084594"/>
-            <wp:docPr id="23" name="Picture 23"/>
+            <wp:docPr id="19" name="Picture 19"/>
             <wp:cNvGraphicFramePr>
               <a:graphicFrameLocks noChangeAspect="1"/>
             </wp:cNvGraphicFramePr>
@@ -6733,11 +6281,11 @@
               <a:graphicData uri="http://schemas.openxmlformats.org/drawingml/2006/picture">
                 <pic:pic>
                   <pic:nvPicPr>
-                    <pic:cNvPr id="0" name="screen_01_login.png"/>
+                    <pic:cNvPr id="0" name="screen_13_purchase_orders.png"/>
                     <pic:cNvPicPr/>
                   </pic:nvPicPr>
                   <pic:blipFill>
-                    <a:blip r:embed="rId14"/>
+                    <a:blip r:embed="rId28"/>
                     <a:stretch>
                       <a:fillRect/>
                     </a:stretch>
@@ -6771,6 +6319,458 @@
         <w:rPr>
           <w:sz w:val="23"/>
         </w:rPr>
+        <w:t>This is the procurement and purchase orders master page of the website.</w:t>
+      </w:r>
+    </w:p>
+    <w:p>
+      <w:pPr>
+        <w:spacing w:after="140" w:line="340" w:lineRule="exact"/>
+      </w:pPr>
+      <w:r>
+        <w:rPr>
+          <w:rFonts w:ascii="Segoe UI Symbol" w:hAnsi="Segoe UI Symbol"/>
+          <w:sz w:val="23"/>
+        </w:rPr>
+        <w:t xml:space="preserve">➢ </w:t>
+      </w:r>
+      <w:r>
+        <w:rPr>
+          <w:sz w:val="23"/>
+        </w:rPr>
+        <w:t>Uses sequential PO numbering (PO-26-01...) with supplier bill number tracking.</w:t>
+      </w:r>
+    </w:p>
+    <w:p>
+      <w:pPr>
+        <w:spacing w:after="140" w:line="340" w:lineRule="exact"/>
+      </w:pPr>
+      <w:r>
+        <w:rPr>
+          <w:rFonts w:ascii="Segoe UI Symbol" w:hAnsi="Segoe UI Symbol"/>
+          <w:sz w:val="23"/>
+        </w:rPr>
+        <w:t xml:space="preserve">➢ </w:t>
+      </w:r>
+      <w:r>
+        <w:rPr>
+          <w:sz w:val="23"/>
+        </w:rPr>
+        <w:t>Displays total invoice value, disbursed payments, and current order status.</w:t>
+      </w:r>
+    </w:p>
+    <w:p>
+      <w:r>
+        <w:br w:type="page"/>
+      </w:r>
+    </w:p>
+    <w:p>
+      <w:pPr>
+        <w:spacing w:before="80" w:after="160"/>
+        <w:jc w:val="left"/>
+      </w:pPr>
+      <w:r>
+        <w:rPr>
+          <w:b/>
+          <w:sz w:val="28"/>
+          <w:u w:val="single"/>
+        </w:rPr>
+        <w:t>Add Purchase Order Page:</w:t>
+      </w:r>
+    </w:p>
+    <w:p>
+      <w:pPr>
+        <w:spacing w:after="240"/>
+        <w:jc w:val="center"/>
+      </w:pPr>
+      <w:r>
+        <w:drawing>
+          <wp:inline xmlns:a="http://schemas.openxmlformats.org/drawingml/2006/main" xmlns:pic="http://schemas.openxmlformats.org/drawingml/2006/picture">
+            <wp:extent cx="5486400" cy="3084594"/>
+            <wp:docPr id="20" name="Picture 20"/>
+            <wp:cNvGraphicFramePr>
+              <a:graphicFrameLocks noChangeAspect="1"/>
+            </wp:cNvGraphicFramePr>
+            <a:graphic>
+              <a:graphicData uri="http://schemas.openxmlformats.org/drawingml/2006/picture">
+                <pic:pic>
+                  <pic:nvPicPr>
+                    <pic:cNvPr id="0" name="screen_14_purchase_create.png"/>
+                    <pic:cNvPicPr/>
+                  </pic:nvPicPr>
+                  <pic:blipFill>
+                    <a:blip r:embed="rId29"/>
+                    <a:stretch>
+                      <a:fillRect/>
+                    </a:stretch>
+                  </pic:blipFill>
+                  <pic:spPr>
+                    <a:xfrm>
+                      <a:off x="0" y="0"/>
+                      <a:ext cx="5486400" cy="3084594"/>
+                    </a:xfrm>
+                    <a:prstGeom prst="rect"/>
+                  </pic:spPr>
+                </pic:pic>
+              </a:graphicData>
+            </a:graphic>
+          </wp:inline>
+        </w:drawing>
+      </w:r>
+    </w:p>
+    <w:p>
+      <w:pPr>
+        <w:spacing w:after="140" w:line="340" w:lineRule="exact"/>
+      </w:pPr>
+      <w:r>
+        <w:rPr>
+          <w:rFonts w:ascii="Segoe UI Symbol" w:hAnsi="Segoe UI Symbol"/>
+          <w:sz w:val="23"/>
+        </w:rPr>
+        <w:t xml:space="preserve">➢ </w:t>
+      </w:r>
+      <w:r>
+        <w:rPr>
+          <w:sz w:val="23"/>
+        </w:rPr>
+        <w:t>This is the new stock procurement purchase order creation form.</w:t>
+      </w:r>
+    </w:p>
+    <w:p>
+      <w:pPr>
+        <w:spacing w:after="140" w:line="340" w:lineRule="exact"/>
+      </w:pPr>
+      <w:r>
+        <w:rPr>
+          <w:rFonts w:ascii="Segoe UI Symbol" w:hAnsi="Segoe UI Symbol"/>
+          <w:sz w:val="23"/>
+        </w:rPr>
+        <w:t xml:space="preserve">➢ </w:t>
+      </w:r>
+      <w:r>
+        <w:rPr>
+          <w:sz w:val="23"/>
+        </w:rPr>
+        <w:t>Creating a PO automatically credits inventory stock without extra receiving forms.</w:t>
+      </w:r>
+    </w:p>
+    <w:p>
+      <w:pPr>
+        <w:spacing w:after="140" w:line="340" w:lineRule="exact"/>
+      </w:pPr>
+      <w:r>
+        <w:rPr>
+          <w:rFonts w:ascii="Segoe UI Symbol" w:hAnsi="Segoe UI Symbol"/>
+          <w:sz w:val="23"/>
+        </w:rPr>
+        <w:t xml:space="preserve">➢ </w:t>
+      </w:r>
+      <w:r>
+        <w:rPr>
+          <w:sz w:val="23"/>
+        </w:rPr>
+        <w:t>Tracks itemized cost prices, tax percentages, and expected delivery dates.</w:t>
+      </w:r>
+    </w:p>
+    <w:p>
+      <w:r>
+        <w:br w:type="page"/>
+      </w:r>
+    </w:p>
+    <w:p>
+      <w:pPr>
+        <w:spacing w:before="80" w:after="160"/>
+        <w:jc w:val="left"/>
+      </w:pPr>
+      <w:r>
+        <w:rPr>
+          <w:b/>
+          <w:sz w:val="28"/>
+          <w:u w:val="single"/>
+        </w:rPr>
+        <w:t>Supplier Bill &amp; Payment Report:</w:t>
+      </w:r>
+    </w:p>
+    <w:p>
+      <w:pPr>
+        <w:spacing w:after="240"/>
+        <w:jc w:val="center"/>
+      </w:pPr>
+      <w:r>
+        <w:drawing>
+          <wp:inline xmlns:a="http://schemas.openxmlformats.org/drawingml/2006/main" xmlns:pic="http://schemas.openxmlformats.org/drawingml/2006/picture">
+            <wp:extent cx="5486400" cy="3084594"/>
+            <wp:docPr id="21" name="Picture 21"/>
+            <wp:cNvGraphicFramePr>
+              <a:graphicFrameLocks noChangeAspect="1"/>
+            </wp:cNvGraphicFramePr>
+            <a:graphic>
+              <a:graphicData uri="http://schemas.openxmlformats.org/drawingml/2006/picture">
+                <pic:pic>
+                  <pic:nvPicPr>
+                    <pic:cNvPr id="0" name="screen_15_supplier_report.png"/>
+                    <pic:cNvPicPr/>
+                  </pic:nvPicPr>
+                  <pic:blipFill>
+                    <a:blip r:embed="rId30"/>
+                    <a:stretch>
+                      <a:fillRect/>
+                    </a:stretch>
+                  </pic:blipFill>
+                  <pic:spPr>
+                    <a:xfrm>
+                      <a:off x="0" y="0"/>
+                      <a:ext cx="5486400" cy="3084594"/>
+                    </a:xfrm>
+                    <a:prstGeom prst="rect"/>
+                  </pic:spPr>
+                </pic:pic>
+              </a:graphicData>
+            </a:graphic>
+          </wp:inline>
+        </w:drawing>
+      </w:r>
+    </w:p>
+    <w:p>
+      <w:pPr>
+        <w:spacing w:after="140" w:line="340" w:lineRule="exact"/>
+      </w:pPr>
+      <w:r>
+        <w:rPr>
+          <w:rFonts w:ascii="Segoe UI Symbol" w:hAnsi="Segoe UI Symbol"/>
+          <w:sz w:val="23"/>
+        </w:rPr>
+        <w:t xml:space="preserve">➢ </w:t>
+      </w:r>
+      <w:r>
+        <w:rPr>
+          <w:sz w:val="23"/>
+        </w:rPr>
+        <w:t>This is the advanced supplier ledger and bill reconciliation report.</w:t>
+      </w:r>
+    </w:p>
+    <w:p>
+      <w:pPr>
+        <w:spacing w:after="140" w:line="340" w:lineRule="exact"/>
+      </w:pPr>
+      <w:r>
+        <w:rPr>
+          <w:rFonts w:ascii="Segoe UI Symbol" w:hAnsi="Segoe UI Symbol"/>
+          <w:sz w:val="23"/>
+        </w:rPr>
+        <w:t xml:space="preserve">➢ </w:t>
+      </w:r>
+      <w:r>
+        <w:rPr>
+          <w:sz w:val="23"/>
+        </w:rPr>
+        <w:t>Provides complete visibility into total procurement, paid amounts, and balances.</w:t>
+      </w:r>
+    </w:p>
+    <w:p>
+      <w:pPr>
+        <w:spacing w:after="140" w:line="340" w:lineRule="exact"/>
+      </w:pPr>
+      <w:r>
+        <w:rPr>
+          <w:rFonts w:ascii="Segoe UI Symbol" w:hAnsi="Segoe UI Symbol"/>
+          <w:sz w:val="23"/>
+        </w:rPr>
+        <w:t xml:space="preserve">➢ </w:t>
+      </w:r>
+      <w:r>
+        <w:rPr>
+          <w:sz w:val="23"/>
+        </w:rPr>
+        <w:t>Offers multi-criteria filtering by supplier, status, date, and 1-click PDF export.</w:t>
+      </w:r>
+    </w:p>
+    <w:p>
+      <w:r>
+        <w:br w:type="page"/>
+      </w:r>
+    </w:p>
+    <w:p>
+      <w:pPr>
+        <w:spacing w:before="80" w:after="160"/>
+        <w:jc w:val="left"/>
+      </w:pPr>
+      <w:r>
+        <w:rPr>
+          <w:b/>
+          <w:sz w:val="28"/>
+          <w:u w:val="single"/>
+        </w:rPr>
+        <w:t>Settings &amp; Branding Page:</w:t>
+      </w:r>
+    </w:p>
+    <w:p>
+      <w:pPr>
+        <w:spacing w:after="240"/>
+        <w:jc w:val="center"/>
+      </w:pPr>
+      <w:r>
+        <w:drawing>
+          <wp:inline xmlns:a="http://schemas.openxmlformats.org/drawingml/2006/main" xmlns:pic="http://schemas.openxmlformats.org/drawingml/2006/picture">
+            <wp:extent cx="5486400" cy="3084594"/>
+            <wp:docPr id="22" name="Picture 22"/>
+            <wp:cNvGraphicFramePr>
+              <a:graphicFrameLocks noChangeAspect="1"/>
+            </wp:cNvGraphicFramePr>
+            <a:graphic>
+              <a:graphicData uri="http://schemas.openxmlformats.org/drawingml/2006/picture">
+                <pic:pic>
+                  <pic:nvPicPr>
+                    <pic:cNvPr id="0" name="screen_16_settings.png"/>
+                    <pic:cNvPicPr/>
+                  </pic:nvPicPr>
+                  <pic:blipFill>
+                    <a:blip r:embed="rId31"/>
+                    <a:stretch>
+                      <a:fillRect/>
+                    </a:stretch>
+                  </pic:blipFill>
+                  <pic:spPr>
+                    <a:xfrm>
+                      <a:off x="0" y="0"/>
+                      <a:ext cx="5486400" cy="3084594"/>
+                    </a:xfrm>
+                    <a:prstGeom prst="rect"/>
+                  </pic:spPr>
+                </pic:pic>
+              </a:graphicData>
+            </a:graphic>
+          </wp:inline>
+        </w:drawing>
+      </w:r>
+    </w:p>
+    <w:p>
+      <w:pPr>
+        <w:spacing w:after="140" w:line="340" w:lineRule="exact"/>
+      </w:pPr>
+      <w:r>
+        <w:rPr>
+          <w:rFonts w:ascii="Segoe UI Symbol" w:hAnsi="Segoe UI Symbol"/>
+          <w:sz w:val="23"/>
+        </w:rPr>
+        <w:t xml:space="preserve">➢ </w:t>
+      </w:r>
+      <w:r>
+        <w:rPr>
+          <w:sz w:val="23"/>
+        </w:rPr>
+        <w:t>This is the enterprise company settings and branding page of the website.</w:t>
+      </w:r>
+    </w:p>
+    <w:p>
+      <w:pPr>
+        <w:spacing w:after="140" w:line="340" w:lineRule="exact"/>
+      </w:pPr>
+      <w:r>
+        <w:rPr>
+          <w:rFonts w:ascii="Segoe UI Symbol" w:hAnsi="Segoe UI Symbol"/>
+          <w:sz w:val="23"/>
+        </w:rPr>
+        <w:t xml:space="preserve">➢ </w:t>
+      </w:r>
+      <w:r>
+        <w:rPr>
+          <w:sz w:val="23"/>
+        </w:rPr>
+        <w:t>Admin can upload custom company logos with live instant thumbnail preview.</w:t>
+      </w:r>
+    </w:p>
+    <w:p>
+      <w:pPr>
+        <w:spacing w:after="140" w:line="340" w:lineRule="exact"/>
+      </w:pPr>
+      <w:r>
+        <w:rPr>
+          <w:rFonts w:ascii="Segoe UI Symbol" w:hAnsi="Segoe UI Symbol"/>
+          <w:sz w:val="23"/>
+        </w:rPr>
+        <w:t xml:space="preserve">➢ </w:t>
+      </w:r>
+      <w:r>
+        <w:rPr>
+          <w:sz w:val="23"/>
+        </w:rPr>
+        <w:t>Configures store contact information, GST number, currency, and theme colors.</w:t>
+      </w:r>
+    </w:p>
+    <w:p>
+      <w:r>
+        <w:br w:type="page"/>
+      </w:r>
+    </w:p>
+    <w:p>
+      <w:pPr>
+        <w:spacing w:before="80" w:after="160"/>
+        <w:jc w:val="left"/>
+      </w:pPr>
+      <w:r>
+        <w:rPr>
+          <w:b/>
+          <w:sz w:val="28"/>
+          <w:u w:val="single"/>
+        </w:rPr>
+        <w:t>Employee Attendance Page:</w:t>
+      </w:r>
+    </w:p>
+    <w:p>
+      <w:pPr>
+        <w:spacing w:after="240"/>
+        <w:jc w:val="center"/>
+      </w:pPr>
+      <w:r>
+        <w:drawing>
+          <wp:inline xmlns:a="http://schemas.openxmlformats.org/drawingml/2006/main" xmlns:pic="http://schemas.openxmlformats.org/drawingml/2006/picture">
+            <wp:extent cx="5486400" cy="3084594"/>
+            <wp:docPr id="23" name="Picture 23"/>
+            <wp:cNvGraphicFramePr>
+              <a:graphicFrameLocks noChangeAspect="1"/>
+            </wp:cNvGraphicFramePr>
+            <a:graphic>
+              <a:graphicData uri="http://schemas.openxmlformats.org/drawingml/2006/picture">
+                <pic:pic>
+                  <pic:nvPicPr>
+                    <pic:cNvPr id="0" name="screen_17_attendance.png"/>
+                    <pic:cNvPicPr/>
+                  </pic:nvPicPr>
+                  <pic:blipFill>
+                    <a:blip r:embed="rId32"/>
+                    <a:stretch>
+                      <a:fillRect/>
+                    </a:stretch>
+                  </pic:blipFill>
+                  <pic:spPr>
+                    <a:xfrm>
+                      <a:off x="0" y="0"/>
+                      <a:ext cx="5486400" cy="3084594"/>
+                    </a:xfrm>
+                    <a:prstGeom prst="rect"/>
+                  </pic:spPr>
+                </pic:pic>
+              </a:graphicData>
+            </a:graphic>
+          </wp:inline>
+        </w:drawing>
+      </w:r>
+    </w:p>
+    <w:p>
+      <w:pPr>
+        <w:spacing w:after="140" w:line="340" w:lineRule="exact"/>
+      </w:pPr>
+      <w:r>
+        <w:rPr>
+          <w:rFonts w:ascii="Segoe UI Symbol" w:hAnsi="Segoe UI Symbol"/>
+          <w:sz w:val="23"/>
+        </w:rPr>
+        <w:t xml:space="preserve">➢ </w:t>
+      </w:r>
+      <w:r>
+        <w:rPr>
+          <w:sz w:val="23"/>
+        </w:rPr>
         <w:t>This is the staff attendance tracking and HR management page of the website.</w:t>
       </w:r>
     </w:p>
@@ -6846,11 +6846,11 @@
               <a:graphicData uri="http://schemas.openxmlformats.org/drawingml/2006/picture">
                 <pic:pic>
                   <pic:nvPicPr>
-                    <pic:cNvPr id="0" name="screen_01_login.png"/>
+                    <pic:cNvPr id="0" name="screen_18_leaves.png"/>
                     <pic:cNvPicPr/>
                   </pic:nvPicPr>
                   <pic:blipFill>
-                    <a:blip r:embed="rId14"/>
+                    <a:blip r:embed="rId33"/>
                     <a:stretch>
                       <a:fillRect/>
                     </a:stretch>

</xml_diff>